<commit_message>
Completed my E-Commerce A/B Test project!
Next steps: update resume.
</commit_message>
<xml_diff>
--- a/_site/docs/antonia_iaquinta_resume.docx
+++ b/_site/docs/antonia_iaquinta_resume.docx
@@ -217,22 +217,37 @@
         <w:t xml:space="preserve">Git, </w:t>
       </w:r>
       <w:r>
-        <w:t xml:space="preserve">Data Visualization, </w:t>
+        <w:t>Data Visualization</w:t>
+      </w:r>
+      <w:r>
+        <w:t xml:space="preserve"> (</w:t>
+      </w:r>
+      <w:r>
+        <w:t>Tableau</w:t>
+      </w:r>
+      <w:r>
+        <w:t xml:space="preserve"> &amp; </w:t>
+      </w:r>
+      <w:r>
+        <w:t>Grafana</w:t>
+      </w:r>
+      <w:r>
+        <w:t>)</w:t>
+      </w:r>
+      <w:r>
+        <w:t xml:space="preserve">, </w:t>
       </w:r>
       <w:r>
         <w:t>Linux, Jira, Azure DevOps,</w:t>
       </w:r>
       <w:r>
-        <w:t xml:space="preserve"> Tableau,</w:t>
-      </w:r>
-      <w:r>
-        <w:t xml:space="preserve"> </w:t>
-      </w:r>
-      <w:r>
-        <w:t xml:space="preserve">IBM DOORS, </w:t>
+        <w:t xml:space="preserve"> IBM DOORS, </w:t>
       </w:r>
       <w:r>
         <w:t>Robot Framework</w:t>
+      </w:r>
+      <w:r>
+        <w:t>, PuTTY</w:t>
       </w:r>
       <w:r>
         <w:br/>
@@ -410,7 +425,13 @@
         <w:t>ing</w:t>
       </w:r>
       <w:r>
-        <w:t xml:space="preserve"> cross-functionally with software, firmware, and hardware teams to integrate unit-level tests early, reducing end-item integration risk </w:t>
+        <w:t xml:space="preserve"> cross-functionally with software, firmware, hardware</w:t>
+      </w:r>
+      <w:r>
+        <w:t xml:space="preserve"> and cyber security</w:t>
+      </w:r>
+      <w:r>
+        <w:t xml:space="preserve"> teams to integrate unit-level tests early, reducing end-item integration risk </w:t>
       </w:r>
     </w:p>
     <w:p>
@@ -485,6 +506,7 @@
         <w:spacing w:before="0" w:after="0"/>
       </w:pPr>
       <w:r>
+        <w:lastRenderedPageBreak/>
         <w:t xml:space="preserve">Performed </w:t>
       </w:r>
       <w:proofErr w:type="spellStart"/>
@@ -496,7 +518,19 @@
       </w:r>
       <w:proofErr w:type="spellEnd"/>
       <w:r>
-        <w:t xml:space="preserve">-based data analysis to validate software feature performance </w:t>
+        <w:t>-based data analysis to v</w:t>
+      </w:r>
+      <w:r>
+        <w:t>erify</w:t>
+      </w:r>
+      <w:r>
+        <w:t xml:space="preserve"> software feature performance</w:t>
+      </w:r>
+      <w:r>
+        <w:t>. Discovered software bugs, documented the analysis, and followed the issues to resolution</w:t>
+      </w:r>
+      <w:r>
+        <w:t xml:space="preserve"> </w:t>
       </w:r>
     </w:p>
     <w:p>
@@ -509,7 +543,6 @@
         <w:spacing w:before="0" w:after="0"/>
       </w:pPr>
       <w:r>
-        <w:lastRenderedPageBreak/>
         <w:t>Supported live aircraft missions and field test</w:t>
       </w:r>
       <w:r>
@@ -694,77 +727,16 @@
           <v:rect id="_x0000_i1030" style="width:0;height:1.5pt" o:hralign="center" o:hrstd="t" o:hr="t"/>
         </w:pict>
       </w:r>
+      <w:bookmarkStart w:id="7" w:name="bja-magnetics-leominster-ma"/>
+      <w:bookmarkEnd w:id="6"/>
     </w:p>
     <w:p>
       <w:pPr>
-        <w:pStyle w:val="Heading3"/>
-      </w:pPr>
-      <w:bookmarkStart w:id="7" w:name="mks-instruments-andover-ma"/>
-      <w:bookmarkEnd w:id="6"/>
-      <w:r>
-        <w:t>MKS Instruments — Andover, MA</w:t>
-      </w:r>
-    </w:p>
-    <w:p>
-      <w:pPr>
-        <w:pStyle w:val="FirstParagraph"/>
-        <w:spacing w:after="0"/>
-      </w:pPr>
-      <w:r>
-        <w:rPr>
-          <w:b/>
-          <w:bCs/>
-        </w:rPr>
-        <w:t>Reliability Engineering Co-op</w:t>
-      </w:r>
-      <w:r>
-        <w:t xml:space="preserve"> | January – April 2017</w:t>
-      </w:r>
-    </w:p>
-    <w:p>
-      <w:pPr>
-        <w:pStyle w:val="FirstParagraph"/>
-        <w:numPr>
-          <w:ilvl w:val="0"/>
-          <w:numId w:val="15"/>
-        </w:numPr>
-        <w:spacing w:before="0" w:after="80"/>
-      </w:pPr>
-      <w:r>
-        <w:t xml:space="preserve">Conducted environmental and reliability testing (vibration, impact, </w:t>
-      </w:r>
-      <w:r>
-        <w:t>temperature</w:t>
-      </w:r>
-      <w:r>
-        <w:t xml:space="preserve">) </w:t>
-      </w:r>
-      <w:r>
-        <w:t xml:space="preserve">on semiconductors. Analyzed </w:t>
-      </w:r>
-      <w:r>
-        <w:t>data through</w:t>
-      </w:r>
-      <w:r>
-        <w:t xml:space="preserve"> Excel and reported on results.</w:t>
-      </w:r>
-    </w:p>
-    <w:p>
-      <w:bookmarkStart w:id="8" w:name="bja-magnetics-leominster-ma"/>
+        <w:pStyle w:val="Heading2"/>
+      </w:pPr>
+      <w:bookmarkStart w:id="8" w:name="projects-activities"/>
+      <w:bookmarkEnd w:id="3"/>
       <w:bookmarkEnd w:id="7"/>
-      <w:r>
-        <w:pict w14:anchorId="47B8CFFF">
-          <v:rect id="_x0000_i1032" style="width:0;height:1.5pt" o:hralign="center" o:hrstd="t" o:hr="t"/>
-        </w:pict>
-      </w:r>
-    </w:p>
-    <w:p>
-      <w:pPr>
-        <w:pStyle w:val="Heading2"/>
-      </w:pPr>
-      <w:bookmarkStart w:id="9" w:name="projects-activities"/>
-      <w:bookmarkEnd w:id="3"/>
-      <w:bookmarkEnd w:id="8"/>
       <w:r>
         <w:t>PROJECTS &amp; ACTIVITIES</w:t>
       </w:r>
@@ -845,7 +817,7 @@
     <w:p>
       <w:r>
         <w:pict w14:anchorId="18103E9C">
-          <v:rect id="_x0000_i1033" style="width:0;height:1.5pt" o:hralign="center" o:hrstd="t" o:hr="t"/>
+          <v:rect id="_x0000_i1032" style="width:0;height:1.5pt" o:hralign="center" o:hrstd="t" o:hr="t"/>
         </w:pict>
       </w:r>
     </w:p>
@@ -853,8 +825,8 @@
       <w:pPr>
         <w:pStyle w:val="Heading2"/>
       </w:pPr>
-      <w:bookmarkStart w:id="10" w:name="certifications-honors"/>
-      <w:bookmarkEnd w:id="9"/>
+      <w:bookmarkStart w:id="9" w:name="certifications-honors"/>
+      <w:bookmarkEnd w:id="8"/>
       <w:r>
         <w:t>CERTIFICATIONS &amp; HONORS</w:t>
       </w:r>
@@ -974,7 +946,7 @@
         <w:t>Tau Alpha Pi National Honors Society for Engineering Technology</w:t>
       </w:r>
       <w:bookmarkEnd w:id="0"/>
-      <w:bookmarkEnd w:id="10"/>
+      <w:bookmarkEnd w:id="9"/>
     </w:p>
     <w:sectPr>
       <w:footnotePr>

</xml_diff>

<commit_message>
Fixing broken links on resume and gitpages
</commit_message>
<xml_diff>
--- a/_site/docs/antonia_iaquinta_resume.docx
+++ b/_site/docs/antonia_iaquinta_resume.docx
@@ -30,7 +30,7 @@
     </w:p>
     <w:p>
       <w:pPr>
-        <w:pStyle w:val="BodyText"/>
+        <w:pStyle w:val="FirstParagraph"/>
         <w:spacing w:before="0" w:after="0"/>
       </w:pPr>
       <w:hyperlink r:id="rId6" w:history="1">
@@ -38,7 +38,7 @@
           <w:rPr>
             <w:rStyle w:val="Hyperlink"/>
           </w:rPr>
-          <w:t>https://github.com/golden_hail.github.io</w:t>
+          <w:t>https://golden-hail.github.io/</w:t>
         </w:r>
       </w:hyperlink>
     </w:p>
@@ -48,63 +48,14 @@
         <w:spacing w:before="0" w:after="0"/>
       </w:pPr>
       <w:r>
-        <w:rPr>
-          <w:b/>
-          <w:bCs/>
-        </w:rPr>
         <w:t>Active Secret Security Clearance (2019)</w:t>
       </w:r>
     </w:p>
     <w:p>
-      <w:r>
-        <w:pict w14:anchorId="4C66E609">
-          <v:rect id="_x0000_i1025" style="width:0;height:1.5pt" o:hralign="center" o:hrstd="t" o:hr="t"/>
-        </w:pict>
-      </w:r>
-    </w:p>
-    <w:p>
-      <w:pPr>
-        <w:pStyle w:val="Heading2"/>
-      </w:pPr>
       <w:bookmarkStart w:id="1" w:name="education"/>
       <w:r>
-        <w:t>EDUCATION</w:t>
-      </w:r>
-    </w:p>
-    <w:p>
-      <w:pPr>
-        <w:pStyle w:val="FirstParagraph"/>
-        <w:spacing w:after="0"/>
-      </w:pPr>
-      <w:r>
-        <w:rPr>
-          <w:b/>
-          <w:bCs/>
-        </w:rPr>
-        <w:t>Wentworth Institute of Technology</w:t>
-      </w:r>
-      <w:r>
-        <w:t>, Boston, MA</w:t>
-      </w:r>
-      <w:r>
-        <w:br/>
-        <w:t>Bachelor of Science in Mechanical Engineering</w:t>
-      </w:r>
-      <w:r>
-        <w:t xml:space="preserve">, </w:t>
-      </w:r>
-      <w:r>
-        <w:t>Minor: Aerospace Engineering</w:t>
-      </w:r>
-      <w:r>
-        <w:br/>
-        <w:t>Magna Cum Laude | GPA: 3.84 / 4.0</w:t>
-      </w:r>
-    </w:p>
-    <w:p>
-      <w:r>
         <w:pict w14:anchorId="2293D664">
-          <v:rect id="_x0000_i1026" style="width:0;height:1.5pt" o:hralign="center" o:hrstd="t" o:hr="t"/>
+          <v:rect id="_x0000_i1103" style="width:0;height:1.5pt" o:hralign="center" o:hrstd="t" o:hr="t"/>
         </w:pict>
       </w:r>
     </w:p>
@@ -177,11 +128,12 @@
       <w:r>
         <w:t xml:space="preserve"> </w:t>
       </w:r>
-      <w:proofErr w:type="spellStart"/>
-      <w:r>
-        <w:t>Matlab</w:t>
-      </w:r>
-      <w:proofErr w:type="spellEnd"/>
+      <w:r>
+        <w:t>M</w:t>
+      </w:r>
+      <w:r>
+        <w:t>ATLAB</w:t>
+      </w:r>
       <w:r>
         <w:t>,</w:t>
       </w:r>
@@ -220,19 +172,7 @@
         <w:t>Data Visualization</w:t>
       </w:r>
       <w:r>
-        <w:t xml:space="preserve"> (</w:t>
-      </w:r>
-      <w:r>
-        <w:t>Tableau</w:t>
-      </w:r>
-      <w:r>
-        <w:t xml:space="preserve"> &amp; </w:t>
-      </w:r>
-      <w:r>
-        <w:t>Grafana</w:t>
-      </w:r>
-      <w:r>
-        <w:t>)</w:t>
+        <w:t xml:space="preserve"> (Tableau &amp; Grafana)</w:t>
       </w:r>
       <w:r>
         <w:t xml:space="preserve">, </w:t>
@@ -288,7 +228,7 @@
     <w:p>
       <w:r>
         <w:pict w14:anchorId="1C947C1E">
-          <v:rect id="_x0000_i1027" style="width:0;height:1.5pt" o:hralign="center" o:hrstd="t" o:hr="t"/>
+          <v:rect id="_x0000_i1104" style="width:0;height:1.5pt" o:hralign="center" o:hrstd="t" o:hr="t"/>
         </w:pict>
       </w:r>
     </w:p>
@@ -394,14 +334,9 @@
       <w:r>
         <w:t xml:space="preserve">Built a </w:t>
       </w:r>
-      <w:proofErr w:type="spellStart"/>
-      <w:r>
-        <w:t>M</w:t>
-      </w:r>
-      <w:r>
-        <w:t>atlab</w:t>
-      </w:r>
-      <w:proofErr w:type="spellEnd"/>
+      <w:r>
+        <w:t>MATLAB</w:t>
+      </w:r>
       <w:r>
         <w:t>-based automated analysis test suite integrated with Robot Framework for real-time data processing and performance evaluation</w:t>
       </w:r>
@@ -437,7 +372,7 @@
     <w:p>
       <w:r>
         <w:pict w14:anchorId="076A50CF">
-          <v:rect id="_x0000_i1028" style="width:0;height:1.5pt" o:hralign="center" o:hrstd="t" o:hr="t"/>
+          <v:rect id="_x0000_i1105" style="width:0;height:1.5pt" o:hralign="center" o:hrstd="t" o:hr="t"/>
         </w:pict>
       </w:r>
     </w:p>
@@ -506,17 +441,11 @@
         <w:spacing w:before="0" w:after="0"/>
       </w:pPr>
       <w:r>
-        <w:lastRenderedPageBreak/>
         <w:t xml:space="preserve">Performed </w:t>
       </w:r>
-      <w:proofErr w:type="spellStart"/>
-      <w:r>
-        <w:t>M</w:t>
-      </w:r>
-      <w:r>
-        <w:t>atlab</w:t>
-      </w:r>
-      <w:proofErr w:type="spellEnd"/>
+      <w:r>
+        <w:t>MATLAB</w:t>
+      </w:r>
       <w:r>
         <w:t>-based data analysis to v</w:t>
       </w:r>
@@ -607,14 +536,9 @@
       <w:r>
         <w:t xml:space="preserve">to be stored and auto-analyzed through SQL and </w:t>
       </w:r>
-      <w:proofErr w:type="spellStart"/>
-      <w:r>
-        <w:t>M</w:t>
-      </w:r>
-      <w:r>
-        <w:t>atlab</w:t>
-      </w:r>
-      <w:proofErr w:type="spellEnd"/>
+      <w:r>
+        <w:t>MATLAB</w:t>
+      </w:r>
       <w:r>
         <w:t xml:space="preserve"> </w:t>
       </w:r>
@@ -632,13 +556,14 @@
         <w:spacing w:before="0" w:after="0"/>
       </w:pPr>
       <w:r>
+        <w:lastRenderedPageBreak/>
         <w:t>Implemented Agile Scrum practices on a 17-person integration team</w:t>
       </w:r>
     </w:p>
     <w:p>
       <w:r>
         <w:pict w14:anchorId="14AADABC">
-          <v:rect id="_x0000_i1029" style="width:0;height:1.5pt" o:hralign="center" o:hrstd="t" o:hr="t"/>
+          <v:rect id="_x0000_i1106" style="width:0;height:1.5pt" o:hralign="center" o:hrstd="t" o:hr="t"/>
         </w:pict>
       </w:r>
     </w:p>
@@ -692,7 +617,7 @@
         <w:spacing w:before="0" w:after="0"/>
       </w:pPr>
       <w:r>
-        <w:t xml:space="preserve">Designed optomechanical housing for two CMOS cameras, compatible with lenses of different geometries, with Solid Edge. </w:t>
+        <w:t xml:space="preserve">Designed optomechanical housing for two CMOS cameras, compatible with lenses of different geometries, with Solid Edge. Prototyped “freeform” lens mount, accounting for varying focal lengths, fields of view, and plate scales for each camera sensor. </w:t>
       </w:r>
     </w:p>
     <w:p>
@@ -705,7 +630,7 @@
         <w:spacing w:before="0" w:after="0"/>
       </w:pPr>
       <w:r>
-        <w:t>Prototyped “freeform” lens mount, accounting for varying focal lengths, fields of view, and plate scales for each camera sensor. Discovered aberration issue with lens and adapted interior geometry of the mount to improve image quality.</w:t>
+        <w:t>Developed rotary stage testing setup to simulate star scanning applications, with a calumniated light source. Also tested fixtures by scanning the night sky.</w:t>
       </w:r>
     </w:p>
     <w:p>
@@ -718,13 +643,13 @@
         <w:spacing w:before="0" w:after="0"/>
       </w:pPr>
       <w:r>
-        <w:t>Developed rotary stage testing setup to simulate star scanning applications, with a calumniated light source. Also tested fixtures by scanning the night sky.</w:t>
+        <w:t>Discovered aberration issue with lens and adapted interior geometry of the mount to improve image quality.</w:t>
       </w:r>
     </w:p>
     <w:p>
       <w:r>
         <w:pict w14:anchorId="79962759">
-          <v:rect id="_x0000_i1030" style="width:0;height:1.5pt" o:hralign="center" o:hrstd="t" o:hr="t"/>
+          <v:rect id="_x0000_i1107" style="width:0;height:1.5pt" o:hralign="center" o:hrstd="t" o:hr="t"/>
         </w:pict>
       </w:r>
       <w:bookmarkStart w:id="7" w:name="bja-magnetics-leominster-ma"/>
@@ -738,23 +663,32 @@
       <w:bookmarkEnd w:id="3"/>
       <w:bookmarkEnd w:id="7"/>
       <w:r>
-        <w:t>PROJECTS &amp; ACTIVITIES</w:t>
+        <w:t>PORTFOLIO PROJECTS</w:t>
       </w:r>
     </w:p>
     <w:p>
       <w:pPr>
         <w:pStyle w:val="BodyText"/>
         <w:spacing w:after="0"/>
+        <w:rPr>
+          <w:b/>
+          <w:bCs/>
+          <w:color w:val="00B050"/>
+        </w:rPr>
       </w:pPr>
       <w:r>
         <w:rPr>
           <w:b/>
           <w:bCs/>
         </w:rPr>
-        <w:t>AIAA Design Competition – Supersonic Jet Engine Design</w:t>
-      </w:r>
-      <w:r>
-        <w:t xml:space="preserve"> | Oct 2017 – May 2018</w:t>
+        <w:t xml:space="preserve">Customer Checkout UI </w:t>
+      </w:r>
+      <w:r>
+        <w:rPr>
+          <w:b/>
+          <w:bCs/>
+        </w:rPr>
+        <w:t>Redesign Experiment</w:t>
       </w:r>
     </w:p>
     <w:p>
@@ -762,62 +696,212 @@
         <w:pStyle w:val="BodyText"/>
         <w:numPr>
           <w:ilvl w:val="0"/>
-          <w:numId w:val="10"/>
+          <w:numId w:val="17"/>
+        </w:numPr>
+        <w:spacing w:before="0" w:after="120"/>
+        <w:rPr>
+          <w:color w:val="00B050"/>
+        </w:rPr>
+      </w:pPr>
+      <w:r>
+        <w:t xml:space="preserve">Executed a </w:t>
+      </w:r>
+      <w:r>
+        <w:t xml:space="preserve">30-day </w:t>
+      </w:r>
+      <w:r>
+        <w:rPr>
+          <w:b/>
+          <w:bCs/>
+        </w:rPr>
+        <w:t>A/B experiment</w:t>
+      </w:r>
+      <w:r>
+        <w:t xml:space="preserve"> evaluating a redesigned checkout </w:t>
+      </w:r>
+      <w:r>
+        <w:t>user interface (UI)</w:t>
+      </w:r>
+      <w:r>
+        <w:t xml:space="preserve"> for an e-commerce website. Applied the </w:t>
+      </w:r>
+      <w:r>
+        <w:rPr>
+          <w:b/>
+          <w:bCs/>
+        </w:rPr>
+        <w:t xml:space="preserve">Z-Test for Proportions </w:t>
+      </w:r>
+      <w:r>
+        <w:t xml:space="preserve">to confirm a </w:t>
+      </w:r>
+      <w:r>
+        <w:rPr>
+          <w:b/>
+          <w:bCs/>
+        </w:rPr>
+        <w:t>+47.03% relative lift in conversion rate</w:t>
+      </w:r>
+      <w:r>
+        <w:t xml:space="preserve"> (40.21% to 59.13%) and a two-sided </w:t>
+      </w:r>
+      <w:r>
+        <w:rPr>
+          <w:b/>
+          <w:bCs/>
+        </w:rPr>
+        <w:t>Mann-Whitney U Test</w:t>
+      </w:r>
+      <w:r>
+        <w:t xml:space="preserve"> to verify no statistical degradation in Average Order Value (AOV). Provided data-backed rollout recommendations to optimize checkout efficiency without sacrificing revenue per transaction.</w:t>
+      </w:r>
+    </w:p>
+    <w:p>
+      <w:pPr>
+        <w:pStyle w:val="BodyText"/>
+        <w:spacing w:before="0" w:after="0"/>
+      </w:pPr>
+      <w:r>
+        <w:rPr>
+          <w:b/>
+          <w:bCs/>
+        </w:rPr>
+        <w:t>Promotional Mailer Campaign Effectiveness</w:t>
+      </w:r>
+    </w:p>
+    <w:p>
+      <w:pPr>
+        <w:pStyle w:val="BodyText"/>
+        <w:numPr>
+          <w:ilvl w:val="0"/>
+          <w:numId w:val="17"/>
         </w:numPr>
         <w:spacing w:before="0" w:after="0"/>
       </w:pPr>
       <w:r>
-        <w:t xml:space="preserve">Performed trade studies </w:t>
-      </w:r>
-      <w:r>
-        <w:t xml:space="preserve">to </w:t>
-      </w:r>
-      <w:r>
-        <w:t>design a dual-spool mixed-flow turbofan for Mach 1.6–1.8 commercial transport; evaluated thermodynamic performance using EES code.</w:t>
+        <w:t xml:space="preserve">Executed an </w:t>
+      </w:r>
+      <w:r>
+        <w:rPr>
+          <w:b/>
+          <w:bCs/>
+        </w:rPr>
+        <w:t>A/B test</w:t>
+      </w:r>
+      <w:r>
+        <w:t xml:space="preserve"> evaluating the impact of low</w:t>
+      </w:r>
+      <w:r>
+        <w:t xml:space="preserve">-cost vs. high-cost promotional mailers for a grocery retailer’s </w:t>
+      </w:r>
+      <w:r>
+        <w:t>‘</w:t>
+      </w:r>
+      <w:r>
+        <w:t>Delivery Club</w:t>
+      </w:r>
+      <w:r>
+        <w:t>’</w:t>
+      </w:r>
+      <w:r>
+        <w:t xml:space="preserve"> membership</w:t>
+      </w:r>
+      <w:r>
+        <w:t xml:space="preserve"> campaign</w:t>
+      </w:r>
+      <w:r>
+        <w:t xml:space="preserve">. Applied </w:t>
+      </w:r>
+      <w:r>
+        <w:t>the</w:t>
+      </w:r>
+      <w:r>
+        <w:t xml:space="preserve"> </w:t>
+      </w:r>
+      <w:r>
+        <w:rPr>
+          <w:b/>
+          <w:bCs/>
+        </w:rPr>
+        <w:t>Chi-Square Test of Independence</w:t>
+      </w:r>
+      <w:r>
+        <w:t xml:space="preserve"> on campaign data to </w:t>
+      </w:r>
+      <w:r>
+        <w:t xml:space="preserve">determine </w:t>
+      </w:r>
+      <w:r>
+        <w:t>the observed 5% lift in sign-ups (32.8% vs. 37.8%) was statistically insignificant and likely attributed to random chance.</w:t>
+      </w:r>
+      <w:r>
+        <w:t xml:space="preserve"> </w:t>
+      </w:r>
+      <w:r>
+        <w:t>Advised</w:t>
+      </w:r>
+      <w:r>
+        <w:t xml:space="preserve"> </w:t>
+      </w:r>
+      <w:r>
+        <w:t>against adopting the higher-cost mail</w:t>
+      </w:r>
+      <w:r>
+        <w:t xml:space="preserve"> for subsequent campaigns,</w:t>
+      </w:r>
+      <w:r>
+        <w:t xml:space="preserve"> preventing unnecessary marketing exp</w:t>
+      </w:r>
+      <w:r>
+        <w:t>enses.</w:t>
+      </w:r>
+      <w:r>
+        <w:t xml:space="preserve"> </w:t>
       </w:r>
     </w:p>
     <w:p>
-      <w:pPr>
-        <w:pStyle w:val="FirstParagraph"/>
-        <w:numPr>
-          <w:ilvl w:val="0"/>
-          <w:numId w:val="10"/>
-        </w:numPr>
-        <w:spacing w:before="0" w:after="120"/>
-      </w:pPr>
-      <w:r>
-        <w:t xml:space="preserve">Modeled a 2D external compression inlet using </w:t>
-      </w:r>
-      <w:r>
-        <w:t>SUPIN (</w:t>
-      </w:r>
-      <w:proofErr w:type="spellStart"/>
-      <w:r>
-        <w:t>SUPersonic</w:t>
-      </w:r>
-      <w:proofErr w:type="spellEnd"/>
-      <w:r>
-        <w:t xml:space="preserve"> </w:t>
-      </w:r>
-      <w:proofErr w:type="spellStart"/>
-      <w:r>
-        <w:t>INlet</w:t>
-      </w:r>
-      <w:proofErr w:type="spellEnd"/>
-      <w:r>
-        <w:t>)</w:t>
-      </w:r>
-      <w:r>
-        <w:t>, NASA Fortran code, achieving a 3.5% Thrust Specific Fuel Consumption improvement</w:t>
-      </w:r>
-      <w:r>
-        <w:t>.</w:t>
+      <w:r>
+        <w:pict w14:anchorId="0F40A075">
+          <v:rect id="_x0000_i1108" style="width:0;height:1.5pt" o:hralign="center" o:hrstd="t" o:hr="t"/>
+        </w:pict>
       </w:r>
     </w:p>
     <w:p>
+      <w:pPr>
+        <w:pStyle w:val="Heading2"/>
+      </w:pPr>
+      <w:r>
+        <w:t>EDUCATION</w:t>
+      </w:r>
+    </w:p>
+    <w:p>
+      <w:pPr>
+        <w:pStyle w:val="FirstParagraph"/>
+        <w:spacing w:after="0"/>
+      </w:pPr>
+      <w:r>
+        <w:rPr>
+          <w:b/>
+          <w:bCs/>
+        </w:rPr>
+        <w:t>Wentworth Institute of Technology</w:t>
+      </w:r>
+      <w:r>
+        <w:t>, Boston, MA</w:t>
+      </w:r>
+      <w:r>
+        <w:br/>
+        <w:t>Bachelor of Science in Mechanical Engineering, Minor: Aerospace Engineering</w:t>
+      </w:r>
+      <w:r>
+        <w:br/>
+        <w:t>Magna Cum Laude | GPA: 3.84 / 4.0</w:t>
+      </w:r>
+    </w:p>
+    <w:p>
       <w:r>
         <w:pict w14:anchorId="18103E9C">
-          <v:rect id="_x0000_i1032" style="width:0;height:1.5pt" o:hralign="center" o:hrstd="t" o:hr="t"/>
+          <v:rect id="_x0000_i1109" style="width:0;height:1.5pt" o:hralign="center" o:bullet="t" o:hrstd="t" o:hr="t"/>
         </w:pict>
       </w:r>
     </w:p>
@@ -889,7 +973,19 @@
         <w:rPr>
           <w:color w:val="000000" w:themeColor="text1"/>
         </w:rPr>
-        <w:t xml:space="preserve">. Application of statistical concepts such as hypothesis tests for measuring the effect of AB Tests. </w:t>
+        <w:t>. Application of statistical concepts such as hypothesis tests for measuring the effect of A</w:t>
+      </w:r>
+      <w:r>
+        <w:rPr>
+          <w:color w:val="000000" w:themeColor="text1"/>
+        </w:rPr>
+        <w:t>/</w:t>
+      </w:r>
+      <w:r>
+        <w:rPr>
+          <w:color w:val="000000" w:themeColor="text1"/>
+        </w:rPr>
+        <w:t xml:space="preserve">B Tests. </w:t>
       </w:r>
       <w:r>
         <w:rPr>
@@ -932,18 +1028,6 @@
       </w:pPr>
       <w:r>
         <w:t>Six Sigma Certified</w:t>
-      </w:r>
-    </w:p>
-    <w:p>
-      <w:pPr>
-        <w:pStyle w:val="Compact"/>
-        <w:numPr>
-          <w:ilvl w:val="0"/>
-          <w:numId w:val="2"/>
-        </w:numPr>
-      </w:pPr>
-      <w:r>
-        <w:t>Tau Alpha Pi National Honors Society for Engineering Technology</w:t>
       </w:r>
       <w:bookmarkEnd w:id="0"/>
       <w:bookmarkEnd w:id="9"/>
@@ -963,6 +1047,11 @@
 
 <file path=word/numbering.xml><?xml version="1.0" encoding="utf-8"?>
 <w:numbering xmlns:wpc="http://schemas.microsoft.com/office/word/2010/wordprocessingCanvas" xmlns:cx="http://schemas.microsoft.com/office/drawing/2014/chartex" xmlns:cx1="http://schemas.microsoft.com/office/drawing/2015/9/8/chartex" xmlns:cx2="http://schemas.microsoft.com/office/drawing/2015/10/21/chartex" xmlns:cx3="http://schemas.microsoft.com/office/drawing/2016/5/9/chartex" xmlns:cx4="http://schemas.microsoft.com/office/drawing/2016/5/10/chartex" xmlns:cx5="http://schemas.microsoft.com/office/drawing/2016/5/11/chartex" xmlns:cx6="http://schemas.microsoft.com/office/drawing/2016/5/12/chartex" xmlns:cx7="http://schemas.microsoft.com/office/drawing/2016/5/13/chartex" xmlns:cx8="http://schemas.microsoft.com/office/drawing/2016/5/14/chartex" xmlns:mc="http://schemas.openxmlformats.org/markup-compatibility/2006" xmlns:aink="http://schemas.microsoft.com/office/drawing/2016/ink" xmlns:am3d="http://schemas.microsoft.com/office/drawing/2017/model3d" xmlns:o="urn:schemas-microsoft-com:office:office" xmlns:oel="http://schemas.microsoft.com/office/2019/extlst" xmlns:r="http://schemas.openxmlformats.org/officeDocument/2006/relationships" xmlns:m="http://schemas.openxmlformats.org/officeDocument/2006/math" xmlns:v="urn:schemas-microsoft-com:vml" xmlns:wp14="http://schemas.microsoft.com/office/word/2010/wordprocessingDrawing" xmlns:wp="http://schemas.openxmlformats.org/drawingml/2006/wordprocessingDrawing" xmlns:w10="urn:schemas-microsoft-com:office:word" xmlns:w="http://schemas.openxmlformats.org/wordprocessingml/2006/main" xmlns:w14="http://schemas.microsoft.com/office/word/2010/wordml" xmlns:w15="http://schemas.microsoft.com/office/word/2012/wordml" xmlns:w16cei="http://schemas.microsoft.com/office/word/2026/wordml/cei" xmlns:w16cex="http://schemas.microsoft.com/office/word/2018/wordml/cex" xmlns:w16cid="http://schemas.microsoft.com/office/word/2016/wordml/cid" xmlns:w16="http://schemas.microsoft.com/office/word/2018/wordml" xmlns:w16du="http://schemas.microsoft.com/office/word/2023/wordml/word16du" xmlns:w16sdtdh="http://schemas.microsoft.com/office/word/2020/wordml/sdtdatahash" xmlns:w16sdtfl="http://schemas.microsoft.com/office/word/2024/wordml/sdtformatlock" xmlns:w16se="http://schemas.microsoft.com/office/word/2015/wordml/symex" xmlns:wpg="http://schemas.microsoft.com/office/word/2010/wordprocessingGroup" xmlns:wpi="http://schemas.microsoft.com/office/word/2010/wordprocessingInk" xmlns:wne="http://schemas.microsoft.com/office/word/2006/wordml" xmlns:wps="http://schemas.microsoft.com/office/word/2010/wordprocessingShape" mc:Ignorable="w14 w15 w16se w16cid w16 w16cex w16sdtdh w16sdtfl w16du wp14">
+  <w:numPicBullet w:numPicBulletId="0">
+    <w:pict>
+      <v:rect id="_x0000_i1025" style="width:0;height:1.5pt" o:hralign="center" o:bullet="t" o:hrstd="t" o:hr="t"/>
+    </w:pict>
+  </w:numPicBullet>
   <w:abstractNum w:abstractNumId="0" w15:restartNumberingAfterBreak="0">
     <w:nsid w:val="0000A990"/>
     <w:multiLevelType w:val="multilevel"/>
@@ -1484,6 +1573,120 @@
     </w:lvl>
   </w:abstractNum>
   <w:abstractNum w:abstractNumId="5" w15:restartNumberingAfterBreak="0">
+    <w:nsid w:val="146C260F"/>
+    <w:multiLevelType w:val="hybridMultilevel"/>
+    <w:tmpl w:val="4D9018BE"/>
+    <w:lvl w:ilvl="0" w:tplc="9F621DCE">
+      <w:start w:val="1"/>
+      <w:numFmt w:val="bullet"/>
+      <w:lvlText w:val=""/>
+      <w:lvlJc w:val="left"/>
+      <w:pPr>
+        <w:ind w:left="720" w:hanging="360"/>
+      </w:pPr>
+      <w:rPr>
+        <w:rFonts w:ascii="Symbol" w:hAnsi="Symbol" w:hint="default"/>
+        <w:color w:val="auto"/>
+      </w:rPr>
+    </w:lvl>
+    <w:lvl w:ilvl="1" w:tplc="04090003" w:tentative="1">
+      <w:start w:val="1"/>
+      <w:numFmt w:val="bullet"/>
+      <w:lvlText w:val="o"/>
+      <w:lvlJc w:val="left"/>
+      <w:pPr>
+        <w:ind w:left="1440" w:hanging="360"/>
+      </w:pPr>
+      <w:rPr>
+        <w:rFonts w:ascii="Courier New" w:hAnsi="Courier New" w:cs="Courier New" w:hint="default"/>
+      </w:rPr>
+    </w:lvl>
+    <w:lvl w:ilvl="2" w:tplc="04090005" w:tentative="1">
+      <w:start w:val="1"/>
+      <w:numFmt w:val="bullet"/>
+      <w:lvlText w:val=""/>
+      <w:lvlJc w:val="left"/>
+      <w:pPr>
+        <w:ind w:left="2160" w:hanging="360"/>
+      </w:pPr>
+      <w:rPr>
+        <w:rFonts w:ascii="Wingdings" w:hAnsi="Wingdings" w:hint="default"/>
+      </w:rPr>
+    </w:lvl>
+    <w:lvl w:ilvl="3" w:tplc="04090001" w:tentative="1">
+      <w:start w:val="1"/>
+      <w:numFmt w:val="bullet"/>
+      <w:lvlText w:val=""/>
+      <w:lvlJc w:val="left"/>
+      <w:pPr>
+        <w:ind w:left="2880" w:hanging="360"/>
+      </w:pPr>
+      <w:rPr>
+        <w:rFonts w:ascii="Symbol" w:hAnsi="Symbol" w:hint="default"/>
+      </w:rPr>
+    </w:lvl>
+    <w:lvl w:ilvl="4" w:tplc="04090003" w:tentative="1">
+      <w:start w:val="1"/>
+      <w:numFmt w:val="bullet"/>
+      <w:lvlText w:val="o"/>
+      <w:lvlJc w:val="left"/>
+      <w:pPr>
+        <w:ind w:left="3600" w:hanging="360"/>
+      </w:pPr>
+      <w:rPr>
+        <w:rFonts w:ascii="Courier New" w:hAnsi="Courier New" w:cs="Courier New" w:hint="default"/>
+      </w:rPr>
+    </w:lvl>
+    <w:lvl w:ilvl="5" w:tplc="04090005" w:tentative="1">
+      <w:start w:val="1"/>
+      <w:numFmt w:val="bullet"/>
+      <w:lvlText w:val=""/>
+      <w:lvlJc w:val="left"/>
+      <w:pPr>
+        <w:ind w:left="4320" w:hanging="360"/>
+      </w:pPr>
+      <w:rPr>
+        <w:rFonts w:ascii="Wingdings" w:hAnsi="Wingdings" w:hint="default"/>
+      </w:rPr>
+    </w:lvl>
+    <w:lvl w:ilvl="6" w:tplc="04090001" w:tentative="1">
+      <w:start w:val="1"/>
+      <w:numFmt w:val="bullet"/>
+      <w:lvlText w:val=""/>
+      <w:lvlJc w:val="left"/>
+      <w:pPr>
+        <w:ind w:left="5040" w:hanging="360"/>
+      </w:pPr>
+      <w:rPr>
+        <w:rFonts w:ascii="Symbol" w:hAnsi="Symbol" w:hint="default"/>
+      </w:rPr>
+    </w:lvl>
+    <w:lvl w:ilvl="7" w:tplc="04090003" w:tentative="1">
+      <w:start w:val="1"/>
+      <w:numFmt w:val="bullet"/>
+      <w:lvlText w:val="o"/>
+      <w:lvlJc w:val="left"/>
+      <w:pPr>
+        <w:ind w:left="5760" w:hanging="360"/>
+      </w:pPr>
+      <w:rPr>
+        <w:rFonts w:ascii="Courier New" w:hAnsi="Courier New" w:cs="Courier New" w:hint="default"/>
+      </w:rPr>
+    </w:lvl>
+    <w:lvl w:ilvl="8" w:tplc="04090005" w:tentative="1">
+      <w:start w:val="1"/>
+      <w:numFmt w:val="bullet"/>
+      <w:lvlText w:val=""/>
+      <w:lvlJc w:val="left"/>
+      <w:pPr>
+        <w:ind w:left="6480" w:hanging="360"/>
+      </w:pPr>
+      <w:rPr>
+        <w:rFonts w:ascii="Wingdings" w:hAnsi="Wingdings" w:hint="default"/>
+      </w:rPr>
+    </w:lvl>
+  </w:abstractNum>
+  <w:abstractNum w:abstractNumId="6" w15:restartNumberingAfterBreak="0">
     <w:nsid w:val="16C11A0E"/>
     <w:multiLevelType w:val="hybridMultilevel"/>
     <w:tmpl w:val="33E41CAE"/>
@@ -1596,7 +1799,7 @@
       </w:rPr>
     </w:lvl>
   </w:abstractNum>
-  <w:abstractNum w:abstractNumId="6" w15:restartNumberingAfterBreak="0">
+  <w:abstractNum w:abstractNumId="7" w15:restartNumberingAfterBreak="0">
     <w:nsid w:val="1E9A3BD0"/>
     <w:multiLevelType w:val="hybridMultilevel"/>
     <w:tmpl w:val="81F4CDF6"/>
@@ -1708,7 +1911,7 @@
       </w:rPr>
     </w:lvl>
   </w:abstractNum>
-  <w:abstractNum w:abstractNumId="7" w15:restartNumberingAfterBreak="0">
+  <w:abstractNum w:abstractNumId="8" w15:restartNumberingAfterBreak="0">
     <w:nsid w:val="283F3754"/>
     <w:multiLevelType w:val="hybridMultilevel"/>
     <w:tmpl w:val="89CC0052"/>
@@ -1821,7 +2024,7 @@
       </w:rPr>
     </w:lvl>
   </w:abstractNum>
-  <w:abstractNum w:abstractNumId="8" w15:restartNumberingAfterBreak="0">
+  <w:abstractNum w:abstractNumId="9" w15:restartNumberingAfterBreak="0">
     <w:nsid w:val="2F853AED"/>
     <w:multiLevelType w:val="hybridMultilevel"/>
     <w:tmpl w:val="6406D842"/>
@@ -1934,7 +2137,7 @@
       </w:rPr>
     </w:lvl>
   </w:abstractNum>
-  <w:abstractNum w:abstractNumId="9" w15:restartNumberingAfterBreak="0">
+  <w:abstractNum w:abstractNumId="10" w15:restartNumberingAfterBreak="0">
     <w:nsid w:val="3C387E80"/>
     <w:multiLevelType w:val="hybridMultilevel"/>
     <w:tmpl w:val="DAE64B52"/>
@@ -2047,7 +2250,7 @@
       </w:rPr>
     </w:lvl>
   </w:abstractNum>
-  <w:abstractNum w:abstractNumId="10" w15:restartNumberingAfterBreak="0">
+  <w:abstractNum w:abstractNumId="11" w15:restartNumberingAfterBreak="0">
     <w:nsid w:val="56F82C3B"/>
     <w:multiLevelType w:val="hybridMultilevel"/>
     <w:tmpl w:val="7D34B7EA"/>
@@ -2159,7 +2362,7 @@
       </w:rPr>
     </w:lvl>
   </w:abstractNum>
-  <w:abstractNum w:abstractNumId="11" w15:restartNumberingAfterBreak="0">
+  <w:abstractNum w:abstractNumId="12" w15:restartNumberingAfterBreak="0">
     <w:nsid w:val="59AC5BD6"/>
     <w:multiLevelType w:val="hybridMultilevel"/>
     <w:tmpl w:val="FF8AE0DA"/>
@@ -2271,7 +2474,7 @@
       </w:rPr>
     </w:lvl>
   </w:abstractNum>
-  <w:abstractNum w:abstractNumId="12" w15:restartNumberingAfterBreak="0">
+  <w:abstractNum w:abstractNumId="13" w15:restartNumberingAfterBreak="0">
     <w:nsid w:val="669F3314"/>
     <w:multiLevelType w:val="hybridMultilevel"/>
     <w:tmpl w:val="89B8E9E2"/>
@@ -2383,7 +2586,7 @@
       </w:rPr>
     </w:lvl>
   </w:abstractNum>
-  <w:abstractNum w:abstractNumId="13" w15:restartNumberingAfterBreak="0">
+  <w:abstractNum w:abstractNumId="14" w15:restartNumberingAfterBreak="0">
     <w:nsid w:val="66DA12B9"/>
     <w:multiLevelType w:val="hybridMultilevel"/>
     <w:tmpl w:val="C0423450"/>
@@ -2497,7 +2700,7 @@
       </w:rPr>
     </w:lvl>
   </w:abstractNum>
-  <w:abstractNum w:abstractNumId="14" w15:restartNumberingAfterBreak="0">
+  <w:abstractNum w:abstractNumId="15" w15:restartNumberingAfterBreak="0">
     <w:nsid w:val="6BEA309E"/>
     <w:multiLevelType w:val="hybridMultilevel"/>
     <w:tmpl w:val="D45C5488"/>
@@ -2610,7 +2813,7 @@
       </w:rPr>
     </w:lvl>
   </w:abstractNum>
-  <w:abstractNum w:abstractNumId="15" w15:restartNumberingAfterBreak="0">
+  <w:abstractNum w:abstractNumId="16" w15:restartNumberingAfterBreak="0">
     <w:nsid w:val="78CA3174"/>
     <w:multiLevelType w:val="hybridMultilevel"/>
     <w:tmpl w:val="F3941AB8"/>
@@ -2730,28 +2933,28 @@
     <w:abstractNumId w:val="1"/>
   </w:num>
   <w:num w:numId="3" w16cid:durableId="1585727914">
-    <w:abstractNumId w:val="12"/>
+    <w:abstractNumId w:val="13"/>
   </w:num>
   <w:num w:numId="4" w16cid:durableId="279604378">
-    <w:abstractNumId w:val="6"/>
+    <w:abstractNumId w:val="7"/>
   </w:num>
   <w:num w:numId="5" w16cid:durableId="867178544">
-    <w:abstractNumId w:val="7"/>
+    <w:abstractNumId w:val="8"/>
   </w:num>
   <w:num w:numId="6" w16cid:durableId="1369143294">
-    <w:abstractNumId w:val="9"/>
+    <w:abstractNumId w:val="10"/>
   </w:num>
   <w:num w:numId="7" w16cid:durableId="196428787">
     <w:abstractNumId w:val="3"/>
   </w:num>
   <w:num w:numId="8" w16cid:durableId="986057700">
-    <w:abstractNumId w:val="10"/>
+    <w:abstractNumId w:val="11"/>
   </w:num>
   <w:num w:numId="9" w16cid:durableId="406197328">
-    <w:abstractNumId w:val="15"/>
+    <w:abstractNumId w:val="16"/>
   </w:num>
   <w:num w:numId="10" w16cid:durableId="1996296945">
-    <w:abstractNumId w:val="14"/>
+    <w:abstractNumId w:val="15"/>
   </w:num>
   <w:num w:numId="11" w16cid:durableId="1490516239">
     <w:abstractNumId w:val="4"/>
@@ -2760,16 +2963,19 @@
     <w:abstractNumId w:val="2"/>
   </w:num>
   <w:num w:numId="13" w16cid:durableId="1607806549">
-    <w:abstractNumId w:val="11"/>
+    <w:abstractNumId w:val="12"/>
   </w:num>
   <w:num w:numId="14" w16cid:durableId="1192183549">
-    <w:abstractNumId w:val="5"/>
+    <w:abstractNumId w:val="6"/>
   </w:num>
   <w:num w:numId="15" w16cid:durableId="1080714721">
-    <w:abstractNumId w:val="8"/>
+    <w:abstractNumId w:val="9"/>
   </w:num>
   <w:num w:numId="16" w16cid:durableId="247271652">
-    <w:abstractNumId w:val="13"/>
+    <w:abstractNumId w:val="14"/>
+  </w:num>
+  <w:num w:numId="17" w16cid:durableId="1851261852">
+    <w:abstractNumId w:val="5"/>
   </w:num>
 </w:numbering>
 </file>
@@ -4024,6 +4230,15 @@
     <w:rPr>
       <w:sz w:val="22"/>
       <w:szCs w:val="22"/>
+    </w:rPr>
+  </w:style>
+  <w:style w:type="character" w:styleId="FollowedHyperlink">
+    <w:name w:val="FollowedHyperlink"/>
+    <w:basedOn w:val="DefaultParagraphFont"/>
+    <w:rsid w:val="00EC0C6E"/>
+    <w:rPr>
+      <w:color w:val="96607D" w:themeColor="followedHyperlink"/>
+      <w:u w:val="single"/>
     </w:rPr>
   </w:style>
 </w:styles>

</xml_diff>

<commit_message>
Resume & minor Causal Impact project updates
</commit_message>
<xml_diff>
--- a/_site/docs/antonia_iaquinta_resume.docx
+++ b/_site/docs/antonia_iaquinta_resume.docx
@@ -1,20 +1,29 @@
 
 <file path=word/document.xml><?xml version="1.0" encoding="utf-8"?>
-<w:document xmlns:wpc="http://schemas.microsoft.com/office/word/2010/wordprocessingCanvas" xmlns:cx="http://schemas.microsoft.com/office/drawing/2014/chartex" xmlns:cx1="http://schemas.microsoft.com/office/drawing/2015/9/8/chartex" xmlns:cx2="http://schemas.microsoft.com/office/drawing/2015/10/21/chartex" xmlns:cx3="http://schemas.microsoft.com/office/drawing/2016/5/9/chartex" xmlns:cx4="http://schemas.microsoft.com/office/drawing/2016/5/10/chartex" xmlns:cx5="http://schemas.microsoft.com/office/drawing/2016/5/11/chartex" xmlns:cx6="http://schemas.microsoft.com/office/drawing/2016/5/12/chartex" xmlns:cx7="http://schemas.microsoft.com/office/drawing/2016/5/13/chartex" xmlns:cx8="http://schemas.microsoft.com/office/drawing/2016/5/14/chartex" xmlns:mc="http://schemas.openxmlformats.org/markup-compatibility/2006" xmlns:aink="http://schemas.microsoft.com/office/drawing/2016/ink" xmlns:am3d="http://schemas.microsoft.com/office/drawing/2017/model3d" xmlns:o="urn:schemas-microsoft-com:office:office" xmlns:oel="http://schemas.microsoft.com/office/2019/extlst" xmlns:r="http://schemas.openxmlformats.org/officeDocument/2006/relationships" xmlns:m="http://schemas.openxmlformats.org/officeDocument/2006/math" xmlns:v="urn:schemas-microsoft-com:vml" xmlns:wp14="http://schemas.microsoft.com/office/word/2010/wordprocessingDrawing" xmlns:wp="http://schemas.openxmlformats.org/drawingml/2006/wordprocessingDrawing" xmlns:w10="urn:schemas-microsoft-com:office:word" xmlns:w="http://schemas.openxmlformats.org/wordprocessingml/2006/main" xmlns:w14="http://schemas.microsoft.com/office/word/2010/wordml" xmlns:w15="http://schemas.microsoft.com/office/word/2012/wordml" xmlns:w16cei="http://schemas.microsoft.com/office/word/2026/wordml/cei" xmlns:w16cex="http://schemas.microsoft.com/office/word/2018/wordml/cex" xmlns:w16cid="http://schemas.microsoft.com/office/word/2016/wordml/cid" xmlns:w16="http://schemas.microsoft.com/office/word/2018/wordml" xmlns:w16du="http://schemas.microsoft.com/office/word/2023/wordml/word16du" xmlns:w16sdtdh="http://schemas.microsoft.com/office/word/2020/wordml/sdtdatahash" xmlns:w16sdtfl="http://schemas.microsoft.com/office/word/2024/wordml/sdtformatlock" xmlns:w16se="http://schemas.microsoft.com/office/word/2015/wordml/symex" xmlns:wpg="http://schemas.microsoft.com/office/word/2010/wordprocessingGroup" xmlns:wpi="http://schemas.microsoft.com/office/word/2010/wordprocessingInk" xmlns:wne="http://schemas.microsoft.com/office/word/2006/wordml" xmlns:wps="http://schemas.microsoft.com/office/word/2010/wordprocessingShape" mc:Ignorable="w14 w15 w16se w16cid w16 w16cex w16sdtdh w16sdtfl w16du wp14">
+<w:document xmlns:wpc="http://schemas.microsoft.com/office/word/2010/wordprocessingCanvas" xmlns:cx="http://schemas.microsoft.com/office/drawing/2014/chartex" xmlns:cx1="http://schemas.microsoft.com/office/drawing/2015/9/8/chartex" xmlns:cx2="http://schemas.microsoft.com/office/drawing/2015/10/21/chartex" xmlns:cx3="http://schemas.microsoft.com/office/drawing/2016/5/9/chartex" xmlns:cx4="http://schemas.microsoft.com/office/drawing/2016/5/10/chartex" xmlns:cx5="http://schemas.microsoft.com/office/drawing/2016/5/11/chartex" xmlns:cx6="http://schemas.microsoft.com/office/drawing/2016/5/12/chartex" xmlns:cx7="http://schemas.microsoft.com/office/drawing/2016/5/13/chartex" xmlns:cx8="http://schemas.microsoft.com/office/drawing/2016/5/14/chartex" xmlns:mc="http://schemas.openxmlformats.org/markup-compatibility/2006" xmlns:aink="http://schemas.microsoft.com/office/drawing/2016/ink" xmlns:am3d="http://schemas.microsoft.com/office/drawing/2017/model3d" xmlns:o="urn:schemas-microsoft-com:office:office" xmlns:oel="http://schemas.microsoft.com/office/2019/extlst" xmlns:r="http://schemas.openxmlformats.org/officeDocument/2006/relationships" xmlns:m="http://schemas.openxmlformats.org/officeDocument/2006/math" xmlns:v="urn:schemas-microsoft-com:vml" xmlns:wp14="http://schemas.microsoft.com/office/word/2010/wordprocessingDrawing" xmlns:wp="http://schemas.openxmlformats.org/drawingml/2006/wordprocessingDrawing" xmlns:w10="urn:schemas-microsoft-com:office:word" xmlns:w="http://schemas.openxmlformats.org/wordprocessingml/2006/main" xmlns:w14="http://schemas.microsoft.com/office/word/2010/wordml" xmlns:w15="http://schemas.microsoft.com/office/word/2012/wordml" xmlns:w16cex="http://schemas.microsoft.com/office/word/2018/wordml/cex" xmlns:w16cid="http://schemas.microsoft.com/office/word/2016/wordml/cid" xmlns:w16="http://schemas.microsoft.com/office/word/2018/wordml" xmlns:w16du="http://schemas.microsoft.com/office/word/2023/wordml/word16du" xmlns:w16sdtdh="http://schemas.microsoft.com/office/word/2020/wordml/sdtdatahash" xmlns:w16sdtfl="http://schemas.microsoft.com/office/word/2024/wordml/sdtformatlock" xmlns:w16se="http://schemas.microsoft.com/office/word/2015/wordml/symex" xmlns:wpg="http://schemas.microsoft.com/office/word/2010/wordprocessingGroup" xmlns:wpi="http://schemas.microsoft.com/office/word/2010/wordprocessingInk" xmlns:wne="http://schemas.microsoft.com/office/word/2006/wordml" xmlns:wps="http://schemas.microsoft.com/office/word/2010/wordprocessingShape" mc:Ignorable="w14 w15 w16se w16cid w16 w16cex w16sdtdh w16sdtfl w16du wp14">
   <w:body>
     <w:p>
       <w:pPr>
         <w:pStyle w:val="Heading1"/>
+        <w:spacing w:after="0"/>
+        <w:rPr>
+          <w:sz w:val="42"/>
+          <w:szCs w:val="42"/>
+        </w:rPr>
       </w:pPr>
       <w:bookmarkStart w:id="0" w:name="antonia-iaquinta"/>
       <w:r>
+        <w:rPr>
+          <w:sz w:val="42"/>
+          <w:szCs w:val="42"/>
+        </w:rPr>
         <w:t>Antonia Iaquinta</w:t>
       </w:r>
     </w:p>
     <w:p>
       <w:pPr>
         <w:pStyle w:val="FirstParagraph"/>
-        <w:spacing w:after="0"/>
+        <w:spacing w:before="120" w:after="0"/>
       </w:pPr>
       <w:r>
         <w:t xml:space="preserve">Norwell, MA | (978) 935-6559 | </w:t>
@@ -55,7 +64,7 @@
       <w:bookmarkStart w:id="1" w:name="education"/>
       <w:r>
         <w:pict w14:anchorId="2293D664">
-          <v:rect id="_x0000_i1103" style="width:0;height:1.5pt" o:hralign="center" o:hrstd="t" o:hr="t"/>
+          <v:rect id="_x0000_i1026" style="width:0;height:1.5pt" o:hralign="center" o:hrstd="t" o:hr="t"/>
         </w:pict>
       </w:r>
     </w:p>
@@ -72,7 +81,7 @@
     <w:p>
       <w:pPr>
         <w:pStyle w:val="FirstParagraph"/>
-        <w:spacing w:after="0"/>
+        <w:spacing w:before="120" w:after="0"/>
       </w:pPr>
       <w:r>
         <w:rPr>
@@ -99,16 +108,11 @@
       <w:r>
         <w:t xml:space="preserve">andas, </w:t>
       </w:r>
-      <w:proofErr w:type="spellStart"/>
       <w:r>
         <w:t>N</w:t>
       </w:r>
       <w:r>
-        <w:t>umpy</w:t>
-      </w:r>
-      <w:proofErr w:type="spellEnd"/>
-      <w:r>
-        <w:t xml:space="preserve">, </w:t>
+        <w:t xml:space="preserve">umpy, </w:t>
       </w:r>
       <w:r>
         <w:t>M</w:t>
@@ -228,7 +232,7 @@
     <w:p>
       <w:r>
         <w:pict w14:anchorId="1C947C1E">
-          <v:rect id="_x0000_i1104" style="width:0;height:1.5pt" o:hralign="center" o:hrstd="t" o:hr="t"/>
+          <v:rect id="_x0000_i1027" style="width:0;height:1.5pt" o:hralign="center" o:hrstd="t" o:hr="t"/>
         </w:pict>
       </w:r>
     </w:p>
@@ -289,7 +293,35 @@
           <w:i/>
           <w:iCs/>
         </w:rPr>
-        <w:t xml:space="preserve"> Anti-Tamper technology for a next-generation radar system, ensuring secure embedded program protection without degrading system performance</w:t>
+        <w:t xml:space="preserve"> Anti-Tamper technology for a next</w:t>
+      </w:r>
+      <w:r>
+        <w:rPr>
+          <w:i/>
+          <w:iCs/>
+        </w:rPr>
+        <w:t xml:space="preserve"> </w:t>
+      </w:r>
+      <w:r>
+        <w:rPr>
+          <w:i/>
+          <w:iCs/>
+        </w:rPr>
+        <w:t xml:space="preserve">generation </w:t>
+      </w:r>
+      <w:r>
+        <w:rPr>
+          <w:i/>
+          <w:iCs/>
+        </w:rPr>
+        <w:t>defense</w:t>
+      </w:r>
+      <w:r>
+        <w:rPr>
+          <w:i/>
+          <w:iCs/>
+        </w:rPr>
+        <w:t xml:space="preserve"> system, ensuring secure embedded program protection without degrading system performance</w:t>
       </w:r>
       <w:r>
         <w:rPr>
@@ -314,7 +346,13 @@
         <w:t xml:space="preserve">ed </w:t>
       </w:r>
       <w:r>
-        <w:t>system-level requirements and verification procedures to ensure compliance with program</w:t>
+        <w:t>system</w:t>
+      </w:r>
+      <w:r>
+        <w:t xml:space="preserve"> </w:t>
+      </w:r>
+      <w:r>
+        <w:t>level requirements and verification procedures to ensure compliance with program</w:t>
       </w:r>
       <w:r>
         <w:t xml:space="preserve">, ATET, and USG </w:t>
@@ -338,7 +376,16 @@
         <w:t>MATLAB</w:t>
       </w:r>
       <w:r>
-        <w:t>-based automated analysis test suite integrated with Robot Framework for real-time data processing and performance evaluation</w:t>
+        <w:t xml:space="preserve"> </w:t>
+      </w:r>
+      <w:r>
+        <w:t xml:space="preserve">based automated analysis test suite integrated with Robot Framework for </w:t>
+      </w:r>
+      <w:r>
+        <w:t>real time</w:t>
+      </w:r>
+      <w:r>
+        <w:t xml:space="preserve"> data processing and performance evaluation</w:t>
       </w:r>
       <w:r>
         <w:t>. Presenting findings to inform design decisions, architecture changes, and capability improvements</w:t>
@@ -366,13 +413,13 @@
         <w:t xml:space="preserve"> and cyber security</w:t>
       </w:r>
       <w:r>
-        <w:t xml:space="preserve"> teams to integrate unit-level tests early, reducing end-item integration risk </w:t>
+        <w:t xml:space="preserve"> teams to integrate unit-level tests early, reducing integration risk </w:t>
       </w:r>
     </w:p>
     <w:p>
       <w:r>
         <w:pict w14:anchorId="076A50CF">
-          <v:rect id="_x0000_i1105" style="width:0;height:1.5pt" o:hralign="center" o:hrstd="t" o:hr="t"/>
+          <v:rect id="_x0000_i1028" style="width:0;height:1.5pt" o:hralign="center" o:hrstd="t" o:hr="t"/>
         </w:pict>
       </w:r>
     </w:p>
@@ -447,7 +494,10 @@
         <w:t>MATLAB</w:t>
       </w:r>
       <w:r>
-        <w:t>-based data analysis to v</w:t>
+        <w:t xml:space="preserve"> </w:t>
+      </w:r>
+      <w:r>
+        <w:t>based data analysis to v</w:t>
       </w:r>
       <w:r>
         <w:t>erify</w:t>
@@ -556,14 +606,14 @@
         <w:spacing w:before="0" w:after="0"/>
       </w:pPr>
       <w:r>
-        <w:lastRenderedPageBreak/>
         <w:t>Implemented Agile Scrum practices on a 17-person integration team</w:t>
       </w:r>
     </w:p>
     <w:p>
       <w:r>
+        <w:lastRenderedPageBreak/>
         <w:pict w14:anchorId="14AADABC">
-          <v:rect id="_x0000_i1106" style="width:0;height:1.5pt" o:hralign="center" o:hrstd="t" o:hr="t"/>
+          <v:rect id="_x0000_i1029" style="width:0;height:1.5pt" o:hralign="center" o:hrstd="t" o:hr="t"/>
         </w:pict>
       </w:r>
     </w:p>
@@ -604,7 +654,35 @@
           <w:i/>
           <w:iCs/>
         </w:rPr>
-        <w:t>Integrated, designed, and tested two commercial-off-the-shelf CMOS cameras to be used for star scanning and attitude determination technologies for Cube Satellite applications</w:t>
+        <w:t xml:space="preserve">Integrated, designed, and tested two commercial-off-the-shelf CMOS cameras to be used for star scanning and attitude determination technologies for </w:t>
+      </w:r>
+      <w:r>
+        <w:rPr>
+          <w:i/>
+          <w:iCs/>
+        </w:rPr>
+        <w:t>c</w:t>
+      </w:r>
+      <w:r>
+        <w:rPr>
+          <w:i/>
+          <w:iCs/>
+        </w:rPr>
+        <w:t xml:space="preserve">ube </w:t>
+      </w:r>
+      <w:r>
+        <w:rPr>
+          <w:i/>
+          <w:iCs/>
+        </w:rPr>
+        <w:t>s</w:t>
+      </w:r>
+      <w:r>
+        <w:rPr>
+          <w:i/>
+          <w:iCs/>
+        </w:rPr>
+        <w:t>atellite applications</w:t>
       </w:r>
     </w:p>
     <w:p>
@@ -617,7 +695,7 @@
         <w:spacing w:before="0" w:after="0"/>
       </w:pPr>
       <w:r>
-        <w:t xml:space="preserve">Designed optomechanical housing for two CMOS cameras, compatible with lenses of different geometries, with Solid Edge. Prototyped “freeform” lens mount, accounting for varying focal lengths, fields of view, and plate scales for each camera sensor. </w:t>
+        <w:t xml:space="preserve">Designed optomechanical housing for two CMOS cameras, compatible with lenses of different geometries, with Solid Edge. Prototyped freeform lens mount, accounting for varying focal lengths, fields of view, and plate scales for each camera sensor. </w:t>
       </w:r>
     </w:p>
     <w:p>
@@ -649,7 +727,7 @@
     <w:p>
       <w:r>
         <w:pict w14:anchorId="79962759">
-          <v:rect id="_x0000_i1107" style="width:0;height:1.5pt" o:hralign="center" o:hrstd="t" o:hr="t"/>
+          <v:rect id="_x0000_i1030" style="width:0;height:1.5pt" o:hralign="center" o:hrstd="t" o:hr="t"/>
         </w:pict>
       </w:r>
       <w:bookmarkStart w:id="7" w:name="bja-magnetics-leominster-ma"/>
@@ -669,7 +747,7 @@
     <w:p>
       <w:pPr>
         <w:pStyle w:val="BodyText"/>
-        <w:spacing w:after="0"/>
+        <w:spacing w:before="100" w:after="0"/>
         <w:rPr>
           <w:b/>
           <w:bCs/>
@@ -740,10 +818,24 @@
           <w:b/>
           <w:bCs/>
         </w:rPr>
-        <w:t>+47.03% relative lift in conversion rate</w:t>
-      </w:r>
-      <w:r>
-        <w:t xml:space="preserve"> (40.21% to 59.13%) and a two-sided </w:t>
+        <w:t xml:space="preserve">+47.03% relative lift in </w:t>
+      </w:r>
+      <w:r>
+        <w:rPr>
+          <w:b/>
+          <w:bCs/>
+        </w:rPr>
+        <w:t xml:space="preserve">cart-to-purchase </w:t>
+      </w:r>
+      <w:r>
+        <w:rPr>
+          <w:b/>
+          <w:bCs/>
+        </w:rPr>
+        <w:t>conversion rate</w:t>
+      </w:r>
+      <w:r>
+        <w:t xml:space="preserve"> and a two-sided </w:t>
       </w:r>
       <w:r>
         <w:rPr>
@@ -753,20 +845,31 @@
         <w:t>Mann-Whitney U Test</w:t>
       </w:r>
       <w:r>
-        <w:t xml:space="preserve"> to verify no statistical degradation in Average Order Value (AOV). Provided data-backed rollout recommendations to optimize checkout efficiency without sacrificing revenue per transaction.</w:t>
+        <w:t xml:space="preserve"> to verify no statistical degradation in Average Order Value (AOV). Provided data</w:t>
+      </w:r>
+      <w:r>
+        <w:t xml:space="preserve"> </w:t>
+      </w:r>
+      <w:r>
+        <w:t>backed rollout recommendations to optimize checkout efficiency without sacrificing revenue per transaction.</w:t>
       </w:r>
     </w:p>
     <w:p>
       <w:pPr>
         <w:pStyle w:val="BodyText"/>
-        <w:spacing w:before="0" w:after="0"/>
+        <w:spacing w:after="0"/>
+        <w:rPr>
+          <w:b/>
+          <w:bCs/>
+          <w:color w:val="00B050"/>
+        </w:rPr>
       </w:pPr>
       <w:r>
         <w:rPr>
           <w:b/>
           <w:bCs/>
         </w:rPr>
-        <w:t>Promotional Mailer Campaign Effectiveness</w:t>
+        <w:t>Quantifying Sales Uplift With Causal Impact Analysis</w:t>
       </w:r>
     </w:p>
     <w:p>
@@ -776,99 +879,45 @@
           <w:ilvl w:val="0"/>
           <w:numId w:val="17"/>
         </w:numPr>
-        <w:spacing w:before="0" w:after="0"/>
-      </w:pPr>
-      <w:r>
-        <w:t xml:space="preserve">Executed an </w:t>
+        <w:spacing w:before="0" w:after="120"/>
+      </w:pPr>
+      <w:r>
+        <w:t>Executed Bayesian time</w:t>
+      </w:r>
+      <w:r>
+        <w:t xml:space="preserve"> </w:t>
+      </w:r>
+      <w:r>
+        <w:t xml:space="preserve">series </w:t>
       </w:r>
       <w:r>
         <w:rPr>
           <w:b/>
           <w:bCs/>
         </w:rPr>
-        <w:t>A/B test</w:t>
-      </w:r>
-      <w:r>
-        <w:t xml:space="preserve"> evaluating the impact of low</w:t>
-      </w:r>
-      <w:r>
-        <w:t xml:space="preserve">-cost vs. high-cost promotional mailers for a grocery retailer’s </w:t>
-      </w:r>
-      <w:r>
-        <w:t>‘</w:t>
-      </w:r>
-      <w:r>
-        <w:t>Delivery Club</w:t>
-      </w:r>
-      <w:r>
-        <w:t>’</w:t>
-      </w:r>
-      <w:r>
-        <w:t xml:space="preserve"> membership</w:t>
-      </w:r>
-      <w:r>
-        <w:t xml:space="preserve"> campaign</w:t>
-      </w:r>
-      <w:r>
-        <w:t xml:space="preserve">. Applied </w:t>
-      </w:r>
-      <w:r>
-        <w:t>the</w:t>
-      </w:r>
-      <w:r>
-        <w:t xml:space="preserve"> </w:t>
-      </w:r>
-      <w:r>
-        <w:rPr>
-          <w:b/>
-          <w:bCs/>
-        </w:rPr>
-        <w:t>Chi-Square Test of Independence</w:t>
-      </w:r>
-      <w:r>
-        <w:t xml:space="preserve"> on campaign data to </w:t>
-      </w:r>
-      <w:r>
-        <w:t xml:space="preserve">determine </w:t>
-      </w:r>
-      <w:r>
-        <w:t>the observed 5% lift in sign-ups (32.8% vs. 37.8%) was statistically insignificant and likely attributed to random chance.</w:t>
-      </w:r>
-      <w:r>
-        <w:t xml:space="preserve"> </w:t>
-      </w:r>
-      <w:r>
-        <w:t>Advised</w:t>
-      </w:r>
-      <w:r>
-        <w:t xml:space="preserve"> </w:t>
-      </w:r>
-      <w:r>
-        <w:t>against adopting the higher-cost mail</w:t>
-      </w:r>
-      <w:r>
-        <w:t xml:space="preserve"> for subsequent campaigns,</w:t>
-      </w:r>
-      <w:r>
-        <w:t xml:space="preserve"> preventing unnecessary marketing exp</w:t>
-      </w:r>
-      <w:r>
-        <w:t>enses.</w:t>
-      </w:r>
-      <w:r>
-        <w:t xml:space="preserve"> </w:t>
+        <w:t>CausalImpact</w:t>
+      </w:r>
+      <w:r>
+        <w:t xml:space="preserve"> to evaluate the net financial impact of a grocery retailer's 'Delivery Club' membership program. Constructed a counterfactual baseline using non-member shopping behavior to isolate true campaign uplift from market trends. Confirmed a statistically significant +41.11% relative lift in member daily spend (+$49.92/day per customer) and $4,592.49 in net incremental revenue</w:t>
+      </w:r>
+      <w:r>
+        <w:t xml:space="preserve">, </w:t>
+      </w:r>
+      <w:r>
+        <w:t>providing leadership with precise top-line figures for ROI and profit margin modeling.</w:t>
       </w:r>
     </w:p>
     <w:p>
       <w:r>
         <w:pict w14:anchorId="0F40A075">
-          <v:rect id="_x0000_i1108" style="width:0;height:1.5pt" o:hralign="center" o:hrstd="t" o:hr="t"/>
+          <v:rect id="_x0000_i1031" style="width:0;height:1.5pt" o:hralign="center" o:hrstd="t" o:hr="t"/>
         </w:pict>
       </w:r>
     </w:p>
     <w:p>
       <w:pPr>
         <w:pStyle w:val="Heading2"/>
+        <w:spacing w:before="0" w:after="0"/>
       </w:pPr>
       <w:r>
         <w:t>EDUCATION</w:t>
@@ -877,7 +926,7 @@
     <w:p>
       <w:pPr>
         <w:pStyle w:val="FirstParagraph"/>
-        <w:spacing w:after="0"/>
+        <w:spacing w:before="120" w:after="0"/>
       </w:pPr>
       <w:r>
         <w:rPr>
@@ -901,7 +950,7 @@
     <w:p>
       <w:r>
         <w:pict w14:anchorId="18103E9C">
-          <v:rect id="_x0000_i1109" style="width:0;height:1.5pt" o:hralign="center" o:bullet="t" o:hrstd="t" o:hr="t"/>
+          <v:rect id="_x0000_i1032" style="width:0;height:1.5pt" o:hralign="center" o:bullet="t" o:hrstd="t" o:hr="t"/>
         </w:pict>
       </w:r>
     </w:p>
@@ -949,73 +998,19 @@
         <w:rPr>
           <w:color w:val="000000" w:themeColor="text1"/>
         </w:rPr>
-        <w:t>Learn</w:t>
+        <w:t>Actionable Learnings</w:t>
       </w:r>
       <w:r>
         <w:rPr>
           <w:color w:val="000000" w:themeColor="text1"/>
         </w:rPr>
-        <w:t>ed Material</w:t>
+        <w:t xml:space="preserve">: </w:t>
       </w:r>
       <w:r>
         <w:rPr>
           <w:color w:val="000000" w:themeColor="text1"/>
         </w:rPr>
-        <w:t>: Extracting &amp; manipulating data using SQL</w:t>
-      </w:r>
-      <w:r>
-        <w:rPr>
-          <w:color w:val="000000" w:themeColor="text1"/>
-        </w:rPr>
-        <w:t xml:space="preserve"> and Python</w:t>
-      </w:r>
-      <w:r>
-        <w:rPr>
-          <w:color w:val="000000" w:themeColor="text1"/>
-        </w:rPr>
-        <w:t>. Application of statistical concepts such as hypothesis tests for measuring the effect of A</w:t>
-      </w:r>
-      <w:r>
-        <w:rPr>
-          <w:color w:val="000000" w:themeColor="text1"/>
-        </w:rPr>
-        <w:t>/</w:t>
-      </w:r>
-      <w:r>
-        <w:rPr>
-          <w:color w:val="000000" w:themeColor="text1"/>
-        </w:rPr>
-        <w:t xml:space="preserve">B Tests. </w:t>
-      </w:r>
-      <w:r>
-        <w:rPr>
-          <w:color w:val="000000" w:themeColor="text1"/>
-        </w:rPr>
-        <w:t>Visualizing</w:t>
-      </w:r>
-      <w:r>
-        <w:rPr>
-          <w:color w:val="000000" w:themeColor="text1"/>
-        </w:rPr>
-        <w:t xml:space="preserve"> data with Python and Tableau. </w:t>
-      </w:r>
-      <w:r>
-        <w:rPr>
-          <w:color w:val="000000" w:themeColor="text1"/>
-        </w:rPr>
-        <w:t xml:space="preserve">Utilizing </w:t>
-      </w:r>
-      <w:r>
-        <w:rPr>
-          <w:color w:val="000000" w:themeColor="text1"/>
-        </w:rPr>
-        <w:t>GitHub</w:t>
-      </w:r>
-      <w:r>
-        <w:rPr>
-          <w:color w:val="000000" w:themeColor="text1"/>
-        </w:rPr>
-        <w:t xml:space="preserve"> for collaboration and version control. </w:t>
+        <w:t>Extracting, manipulating, and visualizing data using SQL, Python, and Tableau. Applying statistical concepts like hypothesis testing to measure A/B test performance. Utilizing GitHub for version control and team collaboration. Preparing data for machine learning through missing value handling, categorical encoding, outlier treatment, feature scaling, feature selection, and model validation. Implementing ML algorithms for regression, classification, clustering, association rule learning, and causal impact analysis to evaluate event impacts over time.</w:t>
       </w:r>
     </w:p>
     <w:p>
@@ -1027,7 +1022,13 @@
         </w:numPr>
       </w:pPr>
       <w:r>
-        <w:t>Six Sigma Certified</w:t>
+        <w:t xml:space="preserve">Six Sigma </w:t>
+      </w:r>
+      <w:r>
+        <w:t xml:space="preserve">White Belt </w:t>
+      </w:r>
+      <w:r>
+        <w:t>Certified</w:t>
       </w:r>
       <w:bookmarkEnd w:id="0"/>
       <w:bookmarkEnd w:id="9"/>
@@ -1037,7 +1038,7 @@
         <w:numRestart w:val="eachSect"/>
       </w:footnotePr>
       <w:pgSz w:w="12240" w:h="15840"/>
-      <w:pgMar w:top="720" w:right="720" w:bottom="720" w:left="720" w:header="720" w:footer="720" w:gutter="0"/>
+      <w:pgMar w:top="360" w:right="720" w:bottom="720" w:left="720" w:header="720" w:footer="720" w:gutter="0"/>
       <w:cols w:space="720"/>
       <w:docGrid w:linePitch="326"/>
     </w:sectPr>
@@ -1046,7 +1047,7 @@
 </file>
 
 <file path=word/numbering.xml><?xml version="1.0" encoding="utf-8"?>
-<w:numbering xmlns:wpc="http://schemas.microsoft.com/office/word/2010/wordprocessingCanvas" xmlns:cx="http://schemas.microsoft.com/office/drawing/2014/chartex" xmlns:cx1="http://schemas.microsoft.com/office/drawing/2015/9/8/chartex" xmlns:cx2="http://schemas.microsoft.com/office/drawing/2015/10/21/chartex" xmlns:cx3="http://schemas.microsoft.com/office/drawing/2016/5/9/chartex" xmlns:cx4="http://schemas.microsoft.com/office/drawing/2016/5/10/chartex" xmlns:cx5="http://schemas.microsoft.com/office/drawing/2016/5/11/chartex" xmlns:cx6="http://schemas.microsoft.com/office/drawing/2016/5/12/chartex" xmlns:cx7="http://schemas.microsoft.com/office/drawing/2016/5/13/chartex" xmlns:cx8="http://schemas.microsoft.com/office/drawing/2016/5/14/chartex" xmlns:mc="http://schemas.openxmlformats.org/markup-compatibility/2006" xmlns:aink="http://schemas.microsoft.com/office/drawing/2016/ink" xmlns:am3d="http://schemas.microsoft.com/office/drawing/2017/model3d" xmlns:o="urn:schemas-microsoft-com:office:office" xmlns:oel="http://schemas.microsoft.com/office/2019/extlst" xmlns:r="http://schemas.openxmlformats.org/officeDocument/2006/relationships" xmlns:m="http://schemas.openxmlformats.org/officeDocument/2006/math" xmlns:v="urn:schemas-microsoft-com:vml" xmlns:wp14="http://schemas.microsoft.com/office/word/2010/wordprocessingDrawing" xmlns:wp="http://schemas.openxmlformats.org/drawingml/2006/wordprocessingDrawing" xmlns:w10="urn:schemas-microsoft-com:office:word" xmlns:w="http://schemas.openxmlformats.org/wordprocessingml/2006/main" xmlns:w14="http://schemas.microsoft.com/office/word/2010/wordml" xmlns:w15="http://schemas.microsoft.com/office/word/2012/wordml" xmlns:w16cei="http://schemas.microsoft.com/office/word/2026/wordml/cei" xmlns:w16cex="http://schemas.microsoft.com/office/word/2018/wordml/cex" xmlns:w16cid="http://schemas.microsoft.com/office/word/2016/wordml/cid" xmlns:w16="http://schemas.microsoft.com/office/word/2018/wordml" xmlns:w16du="http://schemas.microsoft.com/office/word/2023/wordml/word16du" xmlns:w16sdtdh="http://schemas.microsoft.com/office/word/2020/wordml/sdtdatahash" xmlns:w16sdtfl="http://schemas.microsoft.com/office/word/2024/wordml/sdtformatlock" xmlns:w16se="http://schemas.microsoft.com/office/word/2015/wordml/symex" xmlns:wpg="http://schemas.microsoft.com/office/word/2010/wordprocessingGroup" xmlns:wpi="http://schemas.microsoft.com/office/word/2010/wordprocessingInk" xmlns:wne="http://schemas.microsoft.com/office/word/2006/wordml" xmlns:wps="http://schemas.microsoft.com/office/word/2010/wordprocessingShape" mc:Ignorable="w14 w15 w16se w16cid w16 w16cex w16sdtdh w16sdtfl w16du wp14">
+<w:numbering xmlns:wpc="http://schemas.microsoft.com/office/word/2010/wordprocessingCanvas" xmlns:cx="http://schemas.microsoft.com/office/drawing/2014/chartex" xmlns:cx1="http://schemas.microsoft.com/office/drawing/2015/9/8/chartex" xmlns:cx2="http://schemas.microsoft.com/office/drawing/2015/10/21/chartex" xmlns:cx3="http://schemas.microsoft.com/office/drawing/2016/5/9/chartex" xmlns:cx4="http://schemas.microsoft.com/office/drawing/2016/5/10/chartex" xmlns:cx5="http://schemas.microsoft.com/office/drawing/2016/5/11/chartex" xmlns:cx6="http://schemas.microsoft.com/office/drawing/2016/5/12/chartex" xmlns:cx7="http://schemas.microsoft.com/office/drawing/2016/5/13/chartex" xmlns:cx8="http://schemas.microsoft.com/office/drawing/2016/5/14/chartex" xmlns:mc="http://schemas.openxmlformats.org/markup-compatibility/2006" xmlns:aink="http://schemas.microsoft.com/office/drawing/2016/ink" xmlns:am3d="http://schemas.microsoft.com/office/drawing/2017/model3d" xmlns:o="urn:schemas-microsoft-com:office:office" xmlns:oel="http://schemas.microsoft.com/office/2019/extlst" xmlns:r="http://schemas.openxmlformats.org/officeDocument/2006/relationships" xmlns:m="http://schemas.openxmlformats.org/officeDocument/2006/math" xmlns:v="urn:schemas-microsoft-com:vml" xmlns:wp14="http://schemas.microsoft.com/office/word/2010/wordprocessingDrawing" xmlns:wp="http://schemas.openxmlformats.org/drawingml/2006/wordprocessingDrawing" xmlns:w10="urn:schemas-microsoft-com:office:word" xmlns:w="http://schemas.openxmlformats.org/wordprocessingml/2006/main" xmlns:w14="http://schemas.microsoft.com/office/word/2010/wordml" xmlns:w15="http://schemas.microsoft.com/office/word/2012/wordml" xmlns:w16cex="http://schemas.microsoft.com/office/word/2018/wordml/cex" xmlns:w16cid="http://schemas.microsoft.com/office/word/2016/wordml/cid" xmlns:w16="http://schemas.microsoft.com/office/word/2018/wordml" xmlns:w16du="http://schemas.microsoft.com/office/word/2023/wordml/word16du" xmlns:w16sdtdh="http://schemas.microsoft.com/office/word/2020/wordml/sdtdatahash" xmlns:w16sdtfl="http://schemas.microsoft.com/office/word/2024/wordml/sdtformatlock" xmlns:w16se="http://schemas.microsoft.com/office/word/2015/wordml/symex" xmlns:wpg="http://schemas.microsoft.com/office/word/2010/wordprocessingGroup" xmlns:wpi="http://schemas.microsoft.com/office/word/2010/wordprocessingInk" xmlns:wne="http://schemas.microsoft.com/office/word/2006/wordml" xmlns:wps="http://schemas.microsoft.com/office/word/2010/wordprocessingShape" mc:Ignorable="w14 w15 w16se w16cid w16 w16cex w16sdtdh w16sdtfl w16du wp14">
   <w:numPicBullet w:numPicBulletId="0">
     <w:pict>
       <v:rect id="_x0000_i1025" style="width:0;height:1.5pt" o:hralign="center" o:bullet="t" o:hrstd="t" o:hr="t"/>
@@ -1575,7 +1576,7 @@
   <w:abstractNum w:abstractNumId="5" w15:restartNumberingAfterBreak="0">
     <w:nsid w:val="146C260F"/>
     <w:multiLevelType w:val="hybridMultilevel"/>
-    <w:tmpl w:val="4D9018BE"/>
+    <w:tmpl w:val="3A3C94D6"/>
     <w:lvl w:ilvl="0" w:tplc="9F621DCE">
       <w:start w:val="1"/>
       <w:numFmt w:val="bullet"/>

</xml_diff>

<commit_message>
resume and project clean up
</commit_message>
<xml_diff>
--- a/_site/docs/antonia_iaquinta_resume.docx
+++ b/_site/docs/antonia_iaquinta_resume.docx
@@ -52,19 +52,10 @@
       </w:hyperlink>
     </w:p>
     <w:p>
-      <w:pPr>
-        <w:pStyle w:val="FirstParagraph"/>
-        <w:spacing w:before="0" w:after="0"/>
-      </w:pPr>
-      <w:r>
-        <w:t>Active Secret Security Clearance (2019)</w:t>
-      </w:r>
-    </w:p>
-    <w:p>
       <w:bookmarkStart w:id="1" w:name="education"/>
       <w:r>
         <w:pict w14:anchorId="2293D664">
-          <v:rect id="_x0000_i1026" style="width:0;height:1.5pt" o:hralign="center" o:hrstd="t" o:hr="t"/>
+          <v:rect id="_x0000_i1117" style="width:0;height:1.5pt" o:hralign="center" o:hrstd="t" o:hr="t"/>
         </w:pict>
       </w:r>
     </w:p>
@@ -108,11 +99,16 @@
       <w:r>
         <w:t xml:space="preserve">andas, </w:t>
       </w:r>
+      <w:proofErr w:type="spellStart"/>
       <w:r>
         <w:t>N</w:t>
       </w:r>
       <w:r>
-        <w:t xml:space="preserve">umpy, </w:t>
+        <w:t>umpy</w:t>
+      </w:r>
+      <w:proofErr w:type="spellEnd"/>
+      <w:r>
+        <w:t xml:space="preserve">, </w:t>
       </w:r>
       <w:r>
         <w:t>M</w:t>
@@ -158,19 +154,7 @@
         <w:t>Systems &amp; Dev Tools:</w:t>
       </w:r>
       <w:r>
-        <w:t xml:space="preserve"> </w:t>
-      </w:r>
-      <w:r>
-        <w:t>Statistic</w:t>
-      </w:r>
-      <w:r>
-        <w:t>s</w:t>
-      </w:r>
-      <w:r>
-        <w:t xml:space="preserve">, </w:t>
-      </w:r>
-      <w:r>
-        <w:t xml:space="preserve">Git, </w:t>
+        <w:t xml:space="preserve"> Git, </w:t>
       </w:r>
       <w:r>
         <w:t>Data Visualization</w:t>
@@ -217,7 +201,13 @@
         <w:t>Methodologies:</w:t>
       </w:r>
       <w:r>
-        <w:t xml:space="preserve"> Agile/Scrum, Systems Engineering, </w:t>
+        <w:t xml:space="preserve"> </w:t>
+      </w:r>
+      <w:r>
+        <w:t xml:space="preserve">Statistics, </w:t>
+      </w:r>
+      <w:r>
+        <w:t xml:space="preserve">Agile/Scrum, Systems Engineering, </w:t>
       </w:r>
       <w:r>
         <w:t xml:space="preserve">Integration &amp; Test, </w:t>
@@ -232,7 +222,7 @@
     <w:p>
       <w:r>
         <w:pict w14:anchorId="1C947C1E">
-          <v:rect id="_x0000_i1027" style="width:0;height:1.5pt" o:hralign="center" o:hrstd="t" o:hr="t"/>
+          <v:rect id="_x0000_i1118" style="width:0;height:1.5pt" o:hralign="center" o:hrstd="t" o:hr="t"/>
         </w:pict>
       </w:r>
     </w:p>
@@ -388,7 +378,13 @@
         <w:t xml:space="preserve"> data processing and performance evaluation</w:t>
       </w:r>
       <w:r>
-        <w:t>. Presenting findings to inform design decisions, architecture changes, and capability improvements</w:t>
+        <w:t>. Present</w:t>
+      </w:r>
+      <w:r>
+        <w:t xml:space="preserve">ed </w:t>
+      </w:r>
+      <w:r>
+        <w:t>findings to inform design decisions, architecture changes, and capability improvements</w:t>
       </w:r>
     </w:p>
     <w:p>
@@ -404,7 +400,7 @@
         <w:t>Collaborat</w:t>
       </w:r>
       <w:r>
-        <w:t>ing</w:t>
+        <w:t>ed</w:t>
       </w:r>
       <w:r>
         <w:t xml:space="preserve"> cross-functionally with software, firmware, hardware</w:t>
@@ -419,7 +415,7 @@
     <w:p>
       <w:r>
         <w:pict w14:anchorId="076A50CF">
-          <v:rect id="_x0000_i1028" style="width:0;height:1.5pt" o:hralign="center" o:hrstd="t" o:hr="t"/>
+          <v:rect id="_x0000_i1119" style="width:0;height:1.5pt" o:hralign="center" o:hrstd="t" o:hr="t"/>
         </w:pict>
       </w:r>
     </w:p>
@@ -456,7 +452,7 @@
           <w:i/>
           <w:iCs/>
         </w:rPr>
-        <w:t xml:space="preserve">Served as a systems test and integration engineer for Patriot Missile System software across multiple builds </w:t>
+        <w:t xml:space="preserve">Served as a systems test and integration engineer for Patriot Missile System software </w:t>
       </w:r>
     </w:p>
     <w:p>
@@ -611,9 +607,8 @@
     </w:p>
     <w:p>
       <w:r>
-        <w:lastRenderedPageBreak/>
         <w:pict w14:anchorId="14AADABC">
-          <v:rect id="_x0000_i1029" style="width:0;height:1.5pt" o:hralign="center" o:hrstd="t" o:hr="t"/>
+          <v:rect id="_x0000_i1120" style="width:0;height:1.5pt" o:hralign="center" o:hrstd="t" o:hr="t"/>
         </w:pict>
       </w:r>
     </w:p>
@@ -624,6 +619,7 @@
       <w:bookmarkStart w:id="6" w:name="X81b62952a575f7d6a07fe99599f949100819b1a"/>
       <w:bookmarkEnd w:id="5"/>
       <w:r>
+        <w:lastRenderedPageBreak/>
         <w:t>NASA Goddard Space Flight Center — Greenbelt, MD</w:t>
       </w:r>
     </w:p>
@@ -646,88 +642,36 @@
       <w:r>
         <w:t xml:space="preserve"> | August – December 2017</w:t>
       </w:r>
-      <w:r>
-        <w:br/>
-      </w:r>
-      <w:r>
-        <w:rPr>
-          <w:i/>
-          <w:iCs/>
-        </w:rPr>
-        <w:t xml:space="preserve">Integrated, designed, and tested two commercial-off-the-shelf CMOS cameras to be used for star scanning and attitude determination technologies for </w:t>
-      </w:r>
-      <w:r>
-        <w:rPr>
-          <w:i/>
-          <w:iCs/>
-        </w:rPr>
-        <w:t>c</w:t>
-      </w:r>
-      <w:r>
-        <w:rPr>
-          <w:i/>
-          <w:iCs/>
-        </w:rPr>
-        <w:t xml:space="preserve">ube </w:t>
-      </w:r>
-      <w:r>
-        <w:rPr>
-          <w:i/>
-          <w:iCs/>
-        </w:rPr>
-        <w:t>s</w:t>
-      </w:r>
-      <w:r>
-        <w:rPr>
-          <w:i/>
-          <w:iCs/>
-        </w:rPr>
-        <w:t>atellite applications</w:t>
-      </w:r>
     </w:p>
     <w:p>
       <w:pPr>
-        <w:pStyle w:val="BodyText"/>
+        <w:pStyle w:val="ListParagraph"/>
         <w:numPr>
           <w:ilvl w:val="0"/>
-          <w:numId w:val="6"/>
+          <w:numId w:val="18"/>
         </w:numPr>
-        <w:spacing w:before="0" w:after="0"/>
-      </w:pPr>
-      <w:r>
-        <w:t xml:space="preserve">Designed optomechanical housing for two CMOS cameras, compatible with lenses of different geometries, with Solid Edge. Prototyped freeform lens mount, accounting for varying focal lengths, fields of view, and plate scales for each camera sensor. </w:t>
+      </w:pPr>
+      <w:r>
+        <w:t>Integrated, prototyped, and tested CMOS cameras for satellite star-scanning applications, designing custom optomechanical housing using Solid Edge</w:t>
       </w:r>
     </w:p>
     <w:p>
       <w:pPr>
-        <w:pStyle w:val="BodyText"/>
+        <w:pStyle w:val="ListParagraph"/>
         <w:numPr>
           <w:ilvl w:val="0"/>
-          <w:numId w:val="6"/>
+          <w:numId w:val="18"/>
         </w:numPr>
-        <w:spacing w:before="0" w:after="0"/>
-      </w:pPr>
-      <w:r>
-        <w:t>Developed rotary stage testing setup to simulate star scanning applications, with a calumniated light source. Also tested fixtures by scanning the night sky.</w:t>
+        <w:spacing w:after="0"/>
+      </w:pPr>
+      <w:r>
+        <w:t>Built a rotary stage testing setup to simulate star scanning; analyzed optical aberration issues and adjusted interior geometry to optimize image quality</w:t>
       </w:r>
     </w:p>
     <w:p>
-      <w:pPr>
-        <w:pStyle w:val="BodyText"/>
-        <w:numPr>
-          <w:ilvl w:val="0"/>
-          <w:numId w:val="6"/>
-        </w:numPr>
-        <w:spacing w:before="0" w:after="0"/>
-      </w:pPr>
-      <w:r>
-        <w:t>Discovered aberration issue with lens and adapted interior geometry of the mount to improve image quality.</w:t>
-      </w:r>
-    </w:p>
-    <w:p>
       <w:r>
         <w:pict w14:anchorId="79962759">
-          <v:rect id="_x0000_i1030" style="width:0;height:1.5pt" o:hralign="center" o:hrstd="t" o:hr="t"/>
+          <v:rect id="_x0000_i1121" style="width:0;height:1.5pt" o:hralign="center" o:hrstd="t" o:hr="t"/>
         </w:pict>
       </w:r>
       <w:bookmarkStart w:id="7" w:name="bja-magnetics-leominster-ma"/>
@@ -869,7 +813,23 @@
           <w:b/>
           <w:bCs/>
         </w:rPr>
-        <w:t>Quantifying Sales Uplift With Causal Impact Analysis</w:t>
+        <w:t xml:space="preserve">Quantifying Sales Uplift </w:t>
+      </w:r>
+      <w:proofErr w:type="gramStart"/>
+      <w:r>
+        <w:rPr>
+          <w:b/>
+          <w:bCs/>
+        </w:rPr>
+        <w:t>With</w:t>
+      </w:r>
+      <w:proofErr w:type="gramEnd"/>
+      <w:r>
+        <w:rPr>
+          <w:b/>
+          <w:bCs/>
+        </w:rPr>
+        <w:t xml:space="preserve"> Causal Impact Analysis</w:t>
       </w:r>
     </w:p>
     <w:p>
@@ -890,6 +850,7 @@
       <w:r>
         <w:t xml:space="preserve">series </w:t>
       </w:r>
+      <w:proofErr w:type="spellStart"/>
       <w:r>
         <w:rPr>
           <w:b/>
@@ -897,6 +858,7 @@
         </w:rPr>
         <w:t>CausalImpact</w:t>
       </w:r>
+      <w:proofErr w:type="spellEnd"/>
       <w:r>
         <w:t xml:space="preserve"> to evaluate the net financial impact of a grocery retailer's 'Delivery Club' membership program. Constructed a counterfactual baseline using non-member shopping behavior to isolate true campaign uplift from market trends. Confirmed a statistically significant +41.11% relative lift in member daily spend (+$49.92/day per customer) and $4,592.49 in net incremental revenue</w:t>
       </w:r>
@@ -910,7 +872,7 @@
     <w:p>
       <w:r>
         <w:pict w14:anchorId="0F40A075">
-          <v:rect id="_x0000_i1031" style="width:0;height:1.5pt" o:hralign="center" o:hrstd="t" o:hr="t"/>
+          <v:rect id="_x0000_i1122" style="width:0;height:1.5pt" o:hralign="center" o:hrstd="t" o:hr="t"/>
         </w:pict>
       </w:r>
     </w:p>
@@ -950,7 +912,7 @@
     <w:p>
       <w:r>
         <w:pict w14:anchorId="18103E9C">
-          <v:rect id="_x0000_i1032" style="width:0;height:1.5pt" o:hralign="center" o:bullet="t" o:hrstd="t" o:hr="t"/>
+          <v:rect id="_x0000_i1123" style="width:0;height:1.5pt" o:hralign="center" o:bullet="t" o:hrstd="t" o:hr="t"/>
         </w:pict>
       </w:r>
     </w:p>
@@ -961,7 +923,23 @@
       <w:bookmarkStart w:id="9" w:name="certifications-honors"/>
       <w:bookmarkEnd w:id="8"/>
       <w:r>
-        <w:t>CERTIFICATIONS &amp; HONORS</w:t>
+        <w:t>CERTIFICATIONS</w:t>
+      </w:r>
+      <w:r>
+        <w:t xml:space="preserve"> AND CLEARENCE </w:t>
+      </w:r>
+    </w:p>
+    <w:p>
+      <w:pPr>
+        <w:pStyle w:val="FirstParagraph"/>
+        <w:numPr>
+          <w:ilvl w:val="0"/>
+          <w:numId w:val="2"/>
+        </w:numPr>
+        <w:spacing w:before="0" w:after="0"/>
+      </w:pPr>
+      <w:r>
+        <w:t>Active Secret Security Clearance (2019)</w:t>
       </w:r>
     </w:p>
     <w:p>
@@ -973,14 +951,28 @@
         </w:numPr>
       </w:pPr>
       <w:r>
-        <w:t xml:space="preserve">Data Science Infinity Certification – </w:t>
-      </w:r>
-      <w:r>
-        <w:rPr>
-          <w:i/>
-          <w:iCs/>
-        </w:rPr>
-        <w:t>ongoing</w:t>
+        <w:t xml:space="preserve">Data Science Infinity Certification </w:t>
+      </w:r>
+      <w:r>
+        <w:t>|</w:t>
+      </w:r>
+      <w:r>
+        <w:t xml:space="preserve"> </w:t>
+      </w:r>
+      <w:r>
+        <w:t>April</w:t>
+      </w:r>
+      <w:r>
+        <w:t xml:space="preserve"> 202</w:t>
+      </w:r>
+      <w:r>
+        <w:t>6</w:t>
+      </w:r>
+      <w:r>
+        <w:t xml:space="preserve"> – </w:t>
+      </w:r>
+      <w:r>
+        <w:t>present</w:t>
       </w:r>
     </w:p>
     <w:p>
@@ -997,6 +989,7 @@
       <w:r>
         <w:rPr>
           <w:color w:val="000000" w:themeColor="text1"/>
+          <w:u w:val="single"/>
         </w:rPr>
         <w:t>Actionable Learnings</w:t>
       </w:r>
@@ -1348,6 +1341,119 @@
     </w:lvl>
   </w:abstractNum>
   <w:abstractNum w:abstractNumId="3" w15:restartNumberingAfterBreak="0">
+    <w:nsid w:val="09DE317A"/>
+    <w:multiLevelType w:val="hybridMultilevel"/>
+    <w:tmpl w:val="78F2406A"/>
+    <w:lvl w:ilvl="0" w:tplc="04090001">
+      <w:start w:val="1"/>
+      <w:numFmt w:val="bullet"/>
+      <w:lvlText w:val=""/>
+      <w:lvlJc w:val="left"/>
+      <w:pPr>
+        <w:ind w:left="720" w:hanging="360"/>
+      </w:pPr>
+      <w:rPr>
+        <w:rFonts w:ascii="Symbol" w:hAnsi="Symbol" w:hint="default"/>
+      </w:rPr>
+    </w:lvl>
+    <w:lvl w:ilvl="1" w:tplc="04090003" w:tentative="1">
+      <w:start w:val="1"/>
+      <w:numFmt w:val="bullet"/>
+      <w:lvlText w:val="o"/>
+      <w:lvlJc w:val="left"/>
+      <w:pPr>
+        <w:ind w:left="1440" w:hanging="360"/>
+      </w:pPr>
+      <w:rPr>
+        <w:rFonts w:ascii="Courier New" w:hAnsi="Courier New" w:cs="Courier New" w:hint="default"/>
+      </w:rPr>
+    </w:lvl>
+    <w:lvl w:ilvl="2" w:tplc="04090005" w:tentative="1">
+      <w:start w:val="1"/>
+      <w:numFmt w:val="bullet"/>
+      <w:lvlText w:val=""/>
+      <w:lvlJc w:val="left"/>
+      <w:pPr>
+        <w:ind w:left="2160" w:hanging="360"/>
+      </w:pPr>
+      <w:rPr>
+        <w:rFonts w:ascii="Wingdings" w:hAnsi="Wingdings" w:hint="default"/>
+      </w:rPr>
+    </w:lvl>
+    <w:lvl w:ilvl="3" w:tplc="04090001" w:tentative="1">
+      <w:start w:val="1"/>
+      <w:numFmt w:val="bullet"/>
+      <w:lvlText w:val=""/>
+      <w:lvlJc w:val="left"/>
+      <w:pPr>
+        <w:ind w:left="2880" w:hanging="360"/>
+      </w:pPr>
+      <w:rPr>
+        <w:rFonts w:ascii="Symbol" w:hAnsi="Symbol" w:hint="default"/>
+      </w:rPr>
+    </w:lvl>
+    <w:lvl w:ilvl="4" w:tplc="04090003" w:tentative="1">
+      <w:start w:val="1"/>
+      <w:numFmt w:val="bullet"/>
+      <w:lvlText w:val="o"/>
+      <w:lvlJc w:val="left"/>
+      <w:pPr>
+        <w:ind w:left="3600" w:hanging="360"/>
+      </w:pPr>
+      <w:rPr>
+        <w:rFonts w:ascii="Courier New" w:hAnsi="Courier New" w:cs="Courier New" w:hint="default"/>
+      </w:rPr>
+    </w:lvl>
+    <w:lvl w:ilvl="5" w:tplc="04090005" w:tentative="1">
+      <w:start w:val="1"/>
+      <w:numFmt w:val="bullet"/>
+      <w:lvlText w:val=""/>
+      <w:lvlJc w:val="left"/>
+      <w:pPr>
+        <w:ind w:left="4320" w:hanging="360"/>
+      </w:pPr>
+      <w:rPr>
+        <w:rFonts w:ascii="Wingdings" w:hAnsi="Wingdings" w:hint="default"/>
+      </w:rPr>
+    </w:lvl>
+    <w:lvl w:ilvl="6" w:tplc="04090001" w:tentative="1">
+      <w:start w:val="1"/>
+      <w:numFmt w:val="bullet"/>
+      <w:lvlText w:val=""/>
+      <w:lvlJc w:val="left"/>
+      <w:pPr>
+        <w:ind w:left="5040" w:hanging="360"/>
+      </w:pPr>
+      <w:rPr>
+        <w:rFonts w:ascii="Symbol" w:hAnsi="Symbol" w:hint="default"/>
+      </w:rPr>
+    </w:lvl>
+    <w:lvl w:ilvl="7" w:tplc="04090003" w:tentative="1">
+      <w:start w:val="1"/>
+      <w:numFmt w:val="bullet"/>
+      <w:lvlText w:val="o"/>
+      <w:lvlJc w:val="left"/>
+      <w:pPr>
+        <w:ind w:left="5760" w:hanging="360"/>
+      </w:pPr>
+      <w:rPr>
+        <w:rFonts w:ascii="Courier New" w:hAnsi="Courier New" w:cs="Courier New" w:hint="default"/>
+      </w:rPr>
+    </w:lvl>
+    <w:lvl w:ilvl="8" w:tplc="04090005" w:tentative="1">
+      <w:start w:val="1"/>
+      <w:numFmt w:val="bullet"/>
+      <w:lvlText w:val=""/>
+      <w:lvlJc w:val="left"/>
+      <w:pPr>
+        <w:ind w:left="6480" w:hanging="360"/>
+      </w:pPr>
+      <w:rPr>
+        <w:rFonts w:ascii="Wingdings" w:hAnsi="Wingdings" w:hint="default"/>
+      </w:rPr>
+    </w:lvl>
+  </w:abstractNum>
+  <w:abstractNum w:abstractNumId="4" w15:restartNumberingAfterBreak="0">
     <w:nsid w:val="11122404"/>
     <w:multiLevelType w:val="hybridMultilevel"/>
     <w:tmpl w:val="EFC4CC18"/>
@@ -1460,7 +1566,7 @@
       </w:rPr>
     </w:lvl>
   </w:abstractNum>
-  <w:abstractNum w:abstractNumId="4" w15:restartNumberingAfterBreak="0">
+  <w:abstractNum w:abstractNumId="5" w15:restartNumberingAfterBreak="0">
     <w:nsid w:val="132074F7"/>
     <w:multiLevelType w:val="hybridMultilevel"/>
     <w:tmpl w:val="DEE4906E"/>
@@ -1573,7 +1679,7 @@
       </w:rPr>
     </w:lvl>
   </w:abstractNum>
-  <w:abstractNum w:abstractNumId="5" w15:restartNumberingAfterBreak="0">
+  <w:abstractNum w:abstractNumId="6" w15:restartNumberingAfterBreak="0">
     <w:nsid w:val="146C260F"/>
     <w:multiLevelType w:val="hybridMultilevel"/>
     <w:tmpl w:val="3A3C94D6"/>
@@ -1687,7 +1793,7 @@
       </w:rPr>
     </w:lvl>
   </w:abstractNum>
-  <w:abstractNum w:abstractNumId="6" w15:restartNumberingAfterBreak="0">
+  <w:abstractNum w:abstractNumId="7" w15:restartNumberingAfterBreak="0">
     <w:nsid w:val="16C11A0E"/>
     <w:multiLevelType w:val="hybridMultilevel"/>
     <w:tmpl w:val="33E41CAE"/>
@@ -1800,7 +1906,7 @@
       </w:rPr>
     </w:lvl>
   </w:abstractNum>
-  <w:abstractNum w:abstractNumId="7" w15:restartNumberingAfterBreak="0">
+  <w:abstractNum w:abstractNumId="8" w15:restartNumberingAfterBreak="0">
     <w:nsid w:val="1E9A3BD0"/>
     <w:multiLevelType w:val="hybridMultilevel"/>
     <w:tmpl w:val="81F4CDF6"/>
@@ -1912,7 +2018,7 @@
       </w:rPr>
     </w:lvl>
   </w:abstractNum>
-  <w:abstractNum w:abstractNumId="8" w15:restartNumberingAfterBreak="0">
+  <w:abstractNum w:abstractNumId="9" w15:restartNumberingAfterBreak="0">
     <w:nsid w:val="283F3754"/>
     <w:multiLevelType w:val="hybridMultilevel"/>
     <w:tmpl w:val="89CC0052"/>
@@ -2025,7 +2131,7 @@
       </w:rPr>
     </w:lvl>
   </w:abstractNum>
-  <w:abstractNum w:abstractNumId="9" w15:restartNumberingAfterBreak="0">
+  <w:abstractNum w:abstractNumId="10" w15:restartNumberingAfterBreak="0">
     <w:nsid w:val="2F853AED"/>
     <w:multiLevelType w:val="hybridMultilevel"/>
     <w:tmpl w:val="6406D842"/>
@@ -2138,7 +2244,7 @@
       </w:rPr>
     </w:lvl>
   </w:abstractNum>
-  <w:abstractNum w:abstractNumId="10" w15:restartNumberingAfterBreak="0">
+  <w:abstractNum w:abstractNumId="11" w15:restartNumberingAfterBreak="0">
     <w:nsid w:val="3C387E80"/>
     <w:multiLevelType w:val="hybridMultilevel"/>
     <w:tmpl w:val="DAE64B52"/>
@@ -2251,7 +2357,7 @@
       </w:rPr>
     </w:lvl>
   </w:abstractNum>
-  <w:abstractNum w:abstractNumId="11" w15:restartNumberingAfterBreak="0">
+  <w:abstractNum w:abstractNumId="12" w15:restartNumberingAfterBreak="0">
     <w:nsid w:val="56F82C3B"/>
     <w:multiLevelType w:val="hybridMultilevel"/>
     <w:tmpl w:val="7D34B7EA"/>
@@ -2363,7 +2469,7 @@
       </w:rPr>
     </w:lvl>
   </w:abstractNum>
-  <w:abstractNum w:abstractNumId="12" w15:restartNumberingAfterBreak="0">
+  <w:abstractNum w:abstractNumId="13" w15:restartNumberingAfterBreak="0">
     <w:nsid w:val="59AC5BD6"/>
     <w:multiLevelType w:val="hybridMultilevel"/>
     <w:tmpl w:val="FF8AE0DA"/>
@@ -2475,7 +2581,7 @@
       </w:rPr>
     </w:lvl>
   </w:abstractNum>
-  <w:abstractNum w:abstractNumId="13" w15:restartNumberingAfterBreak="0">
+  <w:abstractNum w:abstractNumId="14" w15:restartNumberingAfterBreak="0">
     <w:nsid w:val="669F3314"/>
     <w:multiLevelType w:val="hybridMultilevel"/>
     <w:tmpl w:val="89B8E9E2"/>
@@ -2587,7 +2693,7 @@
       </w:rPr>
     </w:lvl>
   </w:abstractNum>
-  <w:abstractNum w:abstractNumId="14" w15:restartNumberingAfterBreak="0">
+  <w:abstractNum w:abstractNumId="15" w15:restartNumberingAfterBreak="0">
     <w:nsid w:val="66DA12B9"/>
     <w:multiLevelType w:val="hybridMultilevel"/>
     <w:tmpl w:val="C0423450"/>
@@ -2701,7 +2807,7 @@
       </w:rPr>
     </w:lvl>
   </w:abstractNum>
-  <w:abstractNum w:abstractNumId="15" w15:restartNumberingAfterBreak="0">
+  <w:abstractNum w:abstractNumId="16" w15:restartNumberingAfterBreak="0">
     <w:nsid w:val="6BEA309E"/>
     <w:multiLevelType w:val="hybridMultilevel"/>
     <w:tmpl w:val="D45C5488"/>
@@ -2814,7 +2920,7 @@
       </w:rPr>
     </w:lvl>
   </w:abstractNum>
-  <w:abstractNum w:abstractNumId="16" w15:restartNumberingAfterBreak="0">
+  <w:abstractNum w:abstractNumId="17" w15:restartNumberingAfterBreak="0">
     <w:nsid w:val="78CA3174"/>
     <w:multiLevelType w:val="hybridMultilevel"/>
     <w:tmpl w:val="F3941AB8"/>
@@ -2934,49 +3040,52 @@
     <w:abstractNumId w:val="1"/>
   </w:num>
   <w:num w:numId="3" w16cid:durableId="1585727914">
-    <w:abstractNumId w:val="13"/>
+    <w:abstractNumId w:val="14"/>
   </w:num>
   <w:num w:numId="4" w16cid:durableId="279604378">
-    <w:abstractNumId w:val="7"/>
+    <w:abstractNumId w:val="8"/>
   </w:num>
   <w:num w:numId="5" w16cid:durableId="867178544">
-    <w:abstractNumId w:val="8"/>
+    <w:abstractNumId w:val="9"/>
   </w:num>
   <w:num w:numId="6" w16cid:durableId="1369143294">
-    <w:abstractNumId w:val="10"/>
+    <w:abstractNumId w:val="11"/>
   </w:num>
   <w:num w:numId="7" w16cid:durableId="196428787">
-    <w:abstractNumId w:val="3"/>
+    <w:abstractNumId w:val="4"/>
   </w:num>
   <w:num w:numId="8" w16cid:durableId="986057700">
-    <w:abstractNumId w:val="11"/>
+    <w:abstractNumId w:val="12"/>
   </w:num>
   <w:num w:numId="9" w16cid:durableId="406197328">
+    <w:abstractNumId w:val="17"/>
+  </w:num>
+  <w:num w:numId="10" w16cid:durableId="1996296945">
     <w:abstractNumId w:val="16"/>
   </w:num>
-  <w:num w:numId="10" w16cid:durableId="1996296945">
-    <w:abstractNumId w:val="15"/>
-  </w:num>
   <w:num w:numId="11" w16cid:durableId="1490516239">
-    <w:abstractNumId w:val="4"/>
+    <w:abstractNumId w:val="5"/>
   </w:num>
   <w:num w:numId="12" w16cid:durableId="1303193320">
     <w:abstractNumId w:val="2"/>
   </w:num>
   <w:num w:numId="13" w16cid:durableId="1607806549">
-    <w:abstractNumId w:val="12"/>
+    <w:abstractNumId w:val="13"/>
   </w:num>
   <w:num w:numId="14" w16cid:durableId="1192183549">
+    <w:abstractNumId w:val="7"/>
+  </w:num>
+  <w:num w:numId="15" w16cid:durableId="1080714721">
+    <w:abstractNumId w:val="10"/>
+  </w:num>
+  <w:num w:numId="16" w16cid:durableId="247271652">
+    <w:abstractNumId w:val="15"/>
+  </w:num>
+  <w:num w:numId="17" w16cid:durableId="1851261852">
     <w:abstractNumId w:val="6"/>
   </w:num>
-  <w:num w:numId="15" w16cid:durableId="1080714721">
-    <w:abstractNumId w:val="9"/>
-  </w:num>
-  <w:num w:numId="16" w16cid:durableId="247271652">
-    <w:abstractNumId w:val="14"/>
-  </w:num>
-  <w:num w:numId="17" w16cid:durableId="1851261852">
-    <w:abstractNumId w:val="5"/>
+  <w:num w:numId="18" w16cid:durableId="959341704">
+    <w:abstractNumId w:val="3"/>
   </w:num>
 </w:numbering>
 </file>
@@ -3274,7 +3383,6 @@
     <w:next w:val="BodyText"/>
     <w:link w:val="Heading2Char"/>
     <w:uiPriority w:val="9"/>
-    <w:semiHidden/>
     <w:unhideWhenUsed/>
     <w:qFormat/>
     <w:rsid w:val="00A10FD9"/>
@@ -3449,7 +3557,6 @@
   <w:style w:type="character" w:default="1" w:styleId="DefaultParagraphFont">
     <w:name w:val="Default Paragraph Font"/>
     <w:uiPriority w:val="1"/>
-    <w:semiHidden/>
     <w:unhideWhenUsed/>
   </w:style>
   <w:style w:type="table" w:default="1" w:styleId="TableNormal">
@@ -3639,7 +3746,6 @@
     <w:basedOn w:val="DefaultParagraphFont"/>
     <w:link w:val="Heading2"/>
     <w:uiPriority w:val="9"/>
-    <w:semiHidden/>
     <w:rsid w:val="00A10FD9"/>
     <w:rPr>
       <w:rFonts w:asciiTheme="majorHAnsi" w:eastAsiaTheme="majorEastAsia" w:hAnsiTheme="majorHAnsi" w:cstheme="majorBidi"/>

</xml_diff>

<commit_message>
complete resume, sans motivation / summary/ intro section. May try to work that into the res and my gitpage intro
</commit_message>
<xml_diff>
--- a/_site/docs/antonia_iaquinta_resume.docx
+++ b/_site/docs/antonia_iaquinta_resume.docx
@@ -55,7 +55,7 @@
       <w:bookmarkStart w:id="1" w:name="education"/>
       <w:r>
         <w:pict w14:anchorId="2293D664">
-          <v:rect id="_x0000_i1117" style="width:0;height:1.5pt" o:hralign="center" o:hrstd="t" o:hr="t"/>
+          <v:rect id="_x0000_i1026" style="width:0;height:1.5pt" o:hralign="center" o:hrstd="t" o:hr="t"/>
         </w:pict>
       </w:r>
     </w:p>
@@ -116,6 +116,17 @@
       <w:r>
         <w:t xml:space="preserve">atplotlib, </w:t>
       </w:r>
+      <w:proofErr w:type="spellStart"/>
+      <w:r>
+        <w:t>S</w:t>
+      </w:r>
+      <w:r>
+        <w:t>tatsmodels</w:t>
+      </w:r>
+      <w:proofErr w:type="spellEnd"/>
+      <w:r>
+        <w:t xml:space="preserve">, </w:t>
+      </w:r>
       <w:r>
         <w:t>Scikit-L</w:t>
       </w:r>
@@ -129,6 +140,9 @@
         <w:t xml:space="preserve"> </w:t>
       </w:r>
       <w:r>
+        <w:t xml:space="preserve">SQL, </w:t>
+      </w:r>
+      <w:r>
         <w:t>M</w:t>
       </w:r>
       <w:r>
@@ -141,7 +155,7 @@
         <w:t xml:space="preserve"> </w:t>
       </w:r>
       <w:r>
-        <w:t>SQL, EES</w:t>
+        <w:t>EES</w:t>
       </w:r>
       <w:r>
         <w:br/>
@@ -222,7 +236,7 @@
     <w:p>
       <w:r>
         <w:pict w14:anchorId="1C947C1E">
-          <v:rect id="_x0000_i1118" style="width:0;height:1.5pt" o:hralign="center" o:hrstd="t" o:hr="t"/>
+          <v:rect id="_x0000_i1027" style="width:0;height:1.5pt" o:hralign="center" o:hrstd="t" o:hr="t"/>
         </w:pict>
       </w:r>
     </w:p>
@@ -348,7 +362,13 @@
         <w:t xml:space="preserve">, ATET, and USG </w:t>
       </w:r>
       <w:r>
-        <w:t xml:space="preserve">specifications </w:t>
+        <w:t>specifications</w:t>
+      </w:r>
+      <w:r>
+        <w:t>.</w:t>
+      </w:r>
+      <w:r>
+        <w:t xml:space="preserve"> </w:t>
       </w:r>
     </w:p>
     <w:p>
@@ -386,6 +406,9 @@
       <w:r>
         <w:t>findings to inform design decisions, architecture changes, and capability improvements</w:t>
       </w:r>
+      <w:r>
+        <w:t>.</w:t>
+      </w:r>
     </w:p>
     <w:p>
       <w:pPr>
@@ -394,7 +417,7 @@
           <w:ilvl w:val="0"/>
           <w:numId w:val="6"/>
         </w:numPr>
-        <w:spacing w:after="120"/>
+        <w:spacing w:after="0"/>
       </w:pPr>
       <w:r>
         <w:t>Collaborat</w:t>
@@ -409,13 +432,19 @@
         <w:t xml:space="preserve"> and cyber security</w:t>
       </w:r>
       <w:r>
-        <w:t xml:space="preserve"> teams to integrate unit-level tests early, reducing integration risk </w:t>
+        <w:t xml:space="preserve"> teams to integrate unit-level tests early, reducing integration risk</w:t>
+      </w:r>
+      <w:r>
+        <w:t>.</w:t>
+      </w:r>
+      <w:r>
+        <w:t xml:space="preserve"> </w:t>
       </w:r>
     </w:p>
     <w:p>
       <w:r>
         <w:pict w14:anchorId="076A50CF">
-          <v:rect id="_x0000_i1119" style="width:0;height:1.5pt" o:hralign="center" o:hrstd="t" o:hr="t"/>
+          <v:rect id="_x0000_i1028" style="width:0;height:1.5pt" o:hralign="center" o:hrstd="t" o:hr="t"/>
         </w:pict>
       </w:r>
     </w:p>
@@ -471,7 +500,10 @@
         <w:t>; d</w:t>
       </w:r>
       <w:r>
-        <w:t xml:space="preserve">iagnosed integration issues across hardware, software, and test environments </w:t>
+        <w:t>iagnosed integration issues across hardware, software, and test environments</w:t>
+      </w:r>
+      <w:r>
+        <w:t>.</w:t>
       </w:r>
     </w:p>
     <w:p>
@@ -505,7 +537,7 @@
         <w:t>. Discovered software bugs, documented the analysis, and followed the issues to resolution</w:t>
       </w:r>
       <w:r>
-        <w:t xml:space="preserve"> </w:t>
+        <w:t>.</w:t>
       </w:r>
     </w:p>
     <w:p>
@@ -549,7 +581,10 @@
         <w:spacing w:before="0" w:after="0"/>
       </w:pPr>
       <w:r>
-        <w:t xml:space="preserve">Rebuilt team-wide test, analysis, and metrics tracking processes, improving visibility and efficiency </w:t>
+        <w:t>Rebuilt team-wide test, analysis, and metrics tracking processes, improving visibility and efficiency</w:t>
+      </w:r>
+      <w:r>
+        <w:t>.</w:t>
       </w:r>
     </w:p>
     <w:p>
@@ -604,17 +639,21 @@
       <w:r>
         <w:t>Implemented Agile Scrum practices on a 17-person integration team</w:t>
       </w:r>
+      <w:r>
+        <w:t>.</w:t>
+      </w:r>
     </w:p>
     <w:p>
       <w:r>
         <w:pict w14:anchorId="14AADABC">
-          <v:rect id="_x0000_i1120" style="width:0;height:1.5pt" o:hralign="center" o:hrstd="t" o:hr="t"/>
+          <v:rect id="_x0000_i1029" style="width:0;height:1.5pt" o:hralign="center" o:hrstd="t" o:hr="t"/>
         </w:pict>
       </w:r>
     </w:p>
     <w:p>
       <w:pPr>
         <w:pStyle w:val="Heading3"/>
+        <w:spacing w:after="0"/>
       </w:pPr>
       <w:bookmarkStart w:id="6" w:name="X81b62952a575f7d6a07fe99599f949100819b1a"/>
       <w:bookmarkEnd w:id="5"/>
@@ -626,7 +665,7 @@
     <w:p>
       <w:pPr>
         <w:pStyle w:val="FirstParagraph"/>
-        <w:spacing w:after="0"/>
+        <w:spacing w:before="120" w:after="0"/>
         <w:rPr>
           <w:i/>
           <w:iCs/>
@@ -671,7 +710,7 @@
     <w:p>
       <w:r>
         <w:pict w14:anchorId="79962759">
-          <v:rect id="_x0000_i1121" style="width:0;height:1.5pt" o:hralign="center" o:hrstd="t" o:hr="t"/>
+          <v:rect id="_x0000_i1030" style="width:0;height:1.5pt" o:hralign="center" o:hrstd="t" o:hr="t"/>
         </w:pict>
       </w:r>
       <w:bookmarkStart w:id="7" w:name="bja-magnetics-leominster-ma"/>
@@ -695,7 +734,6 @@
         <w:rPr>
           <w:b/>
           <w:bCs/>
-          <w:color w:val="00B050"/>
         </w:rPr>
       </w:pPr>
       <w:r>
@@ -711,6 +749,53 @@
           <w:bCs/>
         </w:rPr>
         <w:t>Redesign Experiment</w:t>
+      </w:r>
+    </w:p>
+    <w:p>
+      <w:pPr>
+        <w:pStyle w:val="BodyText"/>
+        <w:numPr>
+          <w:ilvl w:val="0"/>
+          <w:numId w:val="17"/>
+        </w:numPr>
+        <w:spacing w:before="0" w:after="0"/>
+        <w:rPr>
+          <w:u w:val="single"/>
+        </w:rPr>
+      </w:pPr>
+      <w:r>
+        <w:t>Project Link</w:t>
+      </w:r>
+      <w:r>
+        <w:t xml:space="preserve">: </w:t>
+      </w:r>
+      <w:hyperlink r:id="rId7" w:history="1">
+        <w:r>
+          <w:rPr>
+            <w:rStyle w:val="Hyperlink"/>
+            <w:u w:val="single"/>
+          </w:rPr>
+          <w:t>https://golden-hail.github.io/2026/08/01/E-Commerce-AB-Test.html</w:t>
+        </w:r>
+      </w:hyperlink>
+    </w:p>
+    <w:p>
+      <w:pPr>
+        <w:pStyle w:val="BodyText"/>
+        <w:numPr>
+          <w:ilvl w:val="0"/>
+          <w:numId w:val="17"/>
+        </w:numPr>
+        <w:spacing w:before="0" w:after="0"/>
+      </w:pPr>
+      <w:r>
+        <w:rPr>
+          <w:u w:val="single"/>
+        </w:rPr>
+        <w:t>Business Question</w:t>
+      </w:r>
+      <w:r>
+        <w:t>: Can a redesigned checkout UI increase the cart-to-purchase conversion rate without degrading Average Order Value (AOV) on an e-commerce platform?</w:t>
       </w:r>
     </w:p>
     <w:p>
@@ -721,115 +806,115 @@
           <w:numId w:val="17"/>
         </w:numPr>
         <w:spacing w:before="0" w:after="120"/>
-        <w:rPr>
-          <w:color w:val="00B050"/>
-        </w:rPr>
-      </w:pPr>
-      <w:r>
-        <w:t xml:space="preserve">Executed a </w:t>
-      </w:r>
-      <w:r>
-        <w:t xml:space="preserve">30-day </w:t>
+      </w:pPr>
+      <w:r>
+        <w:rPr>
+          <w:u w:val="single"/>
+        </w:rPr>
+        <w:t xml:space="preserve">Findings &amp; </w:t>
+      </w:r>
+      <w:r>
+        <w:rPr>
+          <w:u w:val="single"/>
+        </w:rPr>
+        <w:t>Recommendation</w:t>
+      </w:r>
+      <w:r>
+        <w:t xml:space="preserve">: Confirmed a </w:t>
       </w:r>
       <w:r>
         <w:rPr>
           <w:b/>
           <w:bCs/>
         </w:rPr>
-        <w:t>A/B experiment</w:t>
-      </w:r>
-      <w:r>
-        <w:t xml:space="preserve"> evaluating a redesigned checkout </w:t>
-      </w:r>
-      <w:r>
-        <w:t>user interface (UI)</w:t>
-      </w:r>
-      <w:r>
-        <w:t xml:space="preserve"> for an e-commerce website. Applied the </w:t>
+        <w:t>+47.03% relative lift</w:t>
+      </w:r>
+      <w:r>
+        <w:t xml:space="preserve"> in conversion rate using a </w:t>
       </w:r>
       <w:r>
         <w:rPr>
           <w:b/>
           <w:bCs/>
         </w:rPr>
-        <w:t xml:space="preserve">Z-Test for Proportions </w:t>
-      </w:r>
-      <w:r>
-        <w:t xml:space="preserve">to confirm a </w:t>
+        <w:t>Z-Test for Proportions</w:t>
+      </w:r>
+      <w:r>
+        <w:t xml:space="preserve"> and verified </w:t>
+      </w:r>
+      <w:r>
+        <w:t xml:space="preserve">there </w:t>
+      </w:r>
+      <w:r>
+        <w:t xml:space="preserve">is </w:t>
+      </w:r>
+      <w:r>
+        <w:t xml:space="preserve">no statistical degradation in AOV </w:t>
+      </w:r>
+      <w:r>
+        <w:t>with the</w:t>
+      </w:r>
+      <w:r>
+        <w:t xml:space="preserve"> </w:t>
       </w:r>
       <w:r>
         <w:rPr>
           <w:b/>
           <w:bCs/>
         </w:rPr>
-        <w:t xml:space="preserve">+47.03% relative lift in </w:t>
-      </w:r>
-      <w:r>
+        <w:t>Mann-Whitney U Test</w:t>
+      </w:r>
+      <w:r>
+        <w:t>.</w:t>
+      </w:r>
+      <w:r>
+        <w:t xml:space="preserve"> </w:t>
+      </w:r>
+      <w:r>
+        <w:t>R</w:t>
+      </w:r>
+      <w:r>
+        <w:t>ecommend</w:t>
+      </w:r>
+      <w:r>
+        <w:t>ed</w:t>
+      </w:r>
+      <w:r>
+        <w:t xml:space="preserve"> a full UI rollout based on efficiency gains</w:t>
+      </w:r>
+      <w:r>
+        <w:t>.</w:t>
+      </w:r>
+    </w:p>
+    <w:p>
+      <w:pPr>
+        <w:pStyle w:val="BodyText"/>
+        <w:spacing w:after="0"/>
         <w:rPr>
           <w:b/>
           <w:bCs/>
         </w:rPr>
-        <w:t xml:space="preserve">cart-to-purchase </w:t>
-      </w:r>
+      </w:pPr>
       <w:r>
         <w:rPr>
           <w:b/>
           <w:bCs/>
         </w:rPr>
-        <w:t>conversion rate</w:t>
-      </w:r>
-      <w:r>
-        <w:t xml:space="preserve"> and a two-sided </w:t>
+        <w:t xml:space="preserve">Quantifying Sales Uplift </w:t>
       </w:r>
       <w:r>
         <w:rPr>
           <w:b/>
           <w:bCs/>
         </w:rPr>
-        <w:t>Mann-Whitney U Test</w:t>
-      </w:r>
-      <w:r>
-        <w:t xml:space="preserve"> to verify no statistical degradation in Average Order Value (AOV). Provided data</w:t>
-      </w:r>
-      <w:r>
-        <w:t xml:space="preserve"> </w:t>
-      </w:r>
-      <w:r>
-        <w:t>backed rollout recommendations to optimize checkout efficiency without sacrificing revenue per transaction.</w:t>
-      </w:r>
-    </w:p>
-    <w:p>
-      <w:pPr>
-        <w:pStyle w:val="BodyText"/>
-        <w:spacing w:after="0"/>
+        <w:t>w</w:t>
+      </w:r>
+      <w:r>
         <w:rPr>
           <w:b/>
           <w:bCs/>
-          <w:color w:val="00B050"/>
-        </w:rPr>
-      </w:pPr>
-      <w:r>
-        <w:rPr>
-          <w:b/>
-          <w:bCs/>
-        </w:rPr>
-        <w:t xml:space="preserve">Quantifying Sales Uplift </w:t>
-      </w:r>
-      <w:proofErr w:type="gramStart"/>
-      <w:r>
-        <w:rPr>
-          <w:b/>
-          <w:bCs/>
-        </w:rPr>
-        <w:t>With</w:t>
-      </w:r>
-      <w:proofErr w:type="gramEnd"/>
-      <w:r>
-        <w:rPr>
-          <w:b/>
-          <w:bCs/>
-        </w:rPr>
-        <w:t xml:space="preserve"> Causal Impact Analysis</w:t>
+        </w:rPr>
+        <w:t>ith Causal Impact Analysis</w:t>
       </w:r>
     </w:p>
     <w:p>
@@ -839,40 +924,123 @@
           <w:ilvl w:val="0"/>
           <w:numId w:val="17"/>
         </w:numPr>
-        <w:spacing w:before="0" w:after="120"/>
-      </w:pPr>
-      <w:r>
-        <w:t>Executed Bayesian time</w:t>
-      </w:r>
-      <w:r>
-        <w:t xml:space="preserve"> </w:t>
-      </w:r>
-      <w:r>
-        <w:t xml:space="preserve">series </w:t>
-      </w:r>
-      <w:proofErr w:type="spellStart"/>
+        <w:spacing w:before="0" w:after="0"/>
+        <w:rPr>
+          <w:u w:val="single"/>
+        </w:rPr>
+      </w:pPr>
+      <w:r>
+        <w:t>Project Link</w:t>
+      </w:r>
+      <w:r>
+        <w:t xml:space="preserve">: </w:t>
+      </w:r>
+      <w:hyperlink r:id="rId8" w:history="1">
+        <w:r>
+          <w:rPr>
+            <w:rStyle w:val="Hyperlink"/>
+            <w:u w:val="single"/>
+          </w:rPr>
+          <w:t>https://golden-hail.github.io/2026/08/15/Causal-Impact-Analysis.html</w:t>
+        </w:r>
+      </w:hyperlink>
+    </w:p>
+    <w:p>
+      <w:pPr>
+        <w:pStyle w:val="BodyText"/>
+        <w:numPr>
+          <w:ilvl w:val="0"/>
+          <w:numId w:val="17"/>
+        </w:numPr>
+        <w:spacing w:before="0" w:after="0"/>
+      </w:pPr>
+      <w:r>
+        <w:rPr>
+          <w:u w:val="single"/>
+        </w:rPr>
+        <w:t>Business Question</w:t>
+      </w:r>
+      <w:r>
+        <w:t xml:space="preserve">: What is the true financial impact and net incremental revenue generated by the 'Delivery Club' membership program after accounting for market trends?  </w:t>
+      </w:r>
+    </w:p>
+    <w:p>
+      <w:pPr>
+        <w:pStyle w:val="BodyText"/>
+        <w:numPr>
+          <w:ilvl w:val="0"/>
+          <w:numId w:val="17"/>
+        </w:numPr>
+        <w:spacing w:before="0" w:after="0"/>
+      </w:pPr>
+      <w:r>
+        <w:rPr>
+          <w:u w:val="single"/>
+        </w:rPr>
+        <w:t>Findings &amp; Recommendation</w:t>
+      </w:r>
+      <w:r>
+        <w:t xml:space="preserve">: Modeled a counterfactual baseline using Bayesian </w:t>
+      </w:r>
       <w:r>
         <w:rPr>
           <w:b/>
           <w:bCs/>
         </w:rPr>
-        <w:t>CausalImpact</w:t>
-      </w:r>
-      <w:proofErr w:type="spellEnd"/>
-      <w:r>
-        <w:t xml:space="preserve"> to evaluate the net financial impact of a grocery retailer's 'Delivery Club' membership program. Constructed a counterfactual baseline using non-member shopping behavior to isolate true campaign uplift from market trends. Confirmed a statistically significant +41.11% relative lift in member daily spend (+$49.92/day per customer) and $4,592.49 in net incremental revenue</w:t>
-      </w:r>
-      <w:r>
-        <w:t xml:space="preserve">, </w:t>
-      </w:r>
-      <w:r>
-        <w:t>providing leadership with precise top-line figures for ROI and profit margin modeling.</w:t>
+        <w:t>Causal</w:t>
+      </w:r>
+      <w:r>
+        <w:rPr>
+          <w:b/>
+          <w:bCs/>
+        </w:rPr>
+        <w:t xml:space="preserve"> </w:t>
+      </w:r>
+      <w:r>
+        <w:rPr>
+          <w:b/>
+          <w:bCs/>
+        </w:rPr>
+        <w:t>Impact</w:t>
+      </w:r>
+      <w:r>
+        <w:rPr>
+          <w:b/>
+          <w:bCs/>
+        </w:rPr>
+        <w:t xml:space="preserve"> </w:t>
+      </w:r>
+      <w:r>
+        <w:t xml:space="preserve">to isolate a significant </w:t>
+      </w:r>
+      <w:r>
+        <w:rPr>
+          <w:b/>
+          <w:bCs/>
+        </w:rPr>
+        <w:t>+41.11% lift</w:t>
+      </w:r>
+      <w:r>
+        <w:t xml:space="preserve"> in member daily spend (+$49.92/day) </w:t>
+      </w:r>
+      <w:r>
+        <w:rPr>
+          <w:b/>
+          <w:bCs/>
+        </w:rPr>
+        <w:t>and $4,592.49 in net incremental revenue</w:t>
+      </w:r>
+      <w:r>
+        <w:t>, providing leadership with exact figures for ROI and profit margin modeling</w:t>
+      </w:r>
+      <w:r>
+        <w:t>.</w:t>
       </w:r>
     </w:p>
     <w:p>
       <w:r>
         <w:pict w14:anchorId="0F40A075">
-          <v:rect id="_x0000_i1122" style="width:0;height:1.5pt" o:hralign="center" o:hrstd="t" o:hr="t"/>
+          <v:rect id="_x0000_i1031" style="width:0;height:1.5pt" o:hralign="center" o:hrstd="t" o:hr="t"/>
         </w:pict>
       </w:r>
     </w:p>
@@ -888,46 +1056,357 @@
     <w:p>
       <w:pPr>
         <w:pStyle w:val="FirstParagraph"/>
-        <w:spacing w:before="120" w:after="0"/>
-      </w:pPr>
+        <w:spacing w:before="80" w:after="0"/>
+      </w:pPr>
+      <w:r>
+        <w:t>Wentworth Institute of Technology,</w:t>
+      </w:r>
+      <w:r>
+        <w:t xml:space="preserve"> Boston, MA</w:t>
+      </w:r>
+      <w:r>
+        <w:br/>
+        <w:t>Bachelor of Science in Mechanical Engineering, Minor: Aerospace Engineering</w:t>
+      </w:r>
+      <w:r>
+        <w:br/>
+        <w:t>Magna Cum Laude | GPA: 3.84 / 4.0</w:t>
+      </w:r>
+    </w:p>
+    <w:p>
+      <w:r>
+        <w:pict w14:anchorId="18103E9C">
+          <v:rect id="_x0000_i1032" style="width:0;height:1.5pt" o:hralign="center" o:bullet="t" o:hrstd="t" o:hr="t"/>
+        </w:pict>
+      </w:r>
+    </w:p>
+    <w:p>
+      <w:pPr>
+        <w:pStyle w:val="Heading2"/>
+      </w:pPr>
+      <w:bookmarkStart w:id="9" w:name="certifications-honors"/>
+      <w:bookmarkEnd w:id="8"/>
+      <w:r>
+        <w:t>CERTIFICATIONS</w:t>
+      </w:r>
+      <w:r>
+        <w:t xml:space="preserve"> AND CLEARENCE </w:t>
+      </w:r>
+    </w:p>
+    <w:p>
+      <w:pPr>
+        <w:pStyle w:val="Compact"/>
+        <w:numPr>
+          <w:ilvl w:val="0"/>
+          <w:numId w:val="2"/>
+        </w:numPr>
+      </w:pPr>
+      <w:r>
+        <w:t xml:space="preserve">Data Science Infinity Certification </w:t>
+      </w:r>
+      <w:r>
+        <w:t>|</w:t>
+      </w:r>
+      <w:r>
+        <w:t xml:space="preserve"> </w:t>
+      </w:r>
+      <w:r>
+        <w:t>April</w:t>
+      </w:r>
+      <w:r>
+        <w:t xml:space="preserve"> 202</w:t>
+      </w:r>
+      <w:r>
+        <w:t>6</w:t>
+      </w:r>
+      <w:r>
+        <w:t xml:space="preserve"> – </w:t>
+      </w:r>
+      <w:r>
+        <w:t>present</w:t>
+      </w:r>
+    </w:p>
+    <w:p>
+      <w:pPr>
+        <w:pStyle w:val="Compact"/>
+        <w:numPr>
+          <w:ilvl w:val="1"/>
+          <w:numId w:val="2"/>
+        </w:numPr>
+        <w:rPr>
+          <w:color w:val="000000" w:themeColor="text1"/>
+        </w:rPr>
+      </w:pPr>
+      <w:r>
+        <w:rPr>
+          <w:color w:val="000000" w:themeColor="text1"/>
+          <w:u w:val="single"/>
+        </w:rPr>
+        <w:t xml:space="preserve">Statistical </w:t>
+      </w:r>
+      <w:r>
+        <w:rPr>
+          <w:color w:val="000000" w:themeColor="text1"/>
+          <w:u w:val="single"/>
+        </w:rPr>
+        <w:t>Analy</w:t>
+      </w:r>
+      <w:r>
+        <w:rPr>
+          <w:color w:val="000000" w:themeColor="text1"/>
+          <w:u w:val="single"/>
+        </w:rPr>
+        <w:t>si</w:t>
+      </w:r>
+      <w:r>
+        <w:rPr>
+          <w:color w:val="000000" w:themeColor="text1"/>
+          <w:u w:val="single"/>
+        </w:rPr>
+        <w:t>s and Visualization</w:t>
+      </w:r>
+      <w:r>
+        <w:rPr>
+          <w:color w:val="000000" w:themeColor="text1"/>
+        </w:rPr>
+        <w:t xml:space="preserve">: </w:t>
+      </w:r>
+      <w:r>
+        <w:rPr>
+          <w:color w:val="000000" w:themeColor="text1"/>
+        </w:rPr>
+        <w:t xml:space="preserve">Extracted, manipulated, and visualized datasets using </w:t>
+      </w:r>
       <w:r>
         <w:rPr>
           <w:b/>
           <w:bCs/>
-        </w:rPr>
-        <w:t>Wentworth Institute of Technology</w:t>
-      </w:r>
-      <w:r>
-        <w:t>, Boston, MA</w:t>
-      </w:r>
-      <w:r>
-        <w:br/>
-        <w:t>Bachelor of Science in Mechanical Engineering, Minor: Aerospace Engineering</w:t>
-      </w:r>
-      <w:r>
-        <w:br/>
-        <w:t>Magna Cum Laude | GPA: 3.84 / 4.0</w:t>
+          <w:color w:val="000000" w:themeColor="text1"/>
+        </w:rPr>
+        <w:t>SQL</w:t>
+      </w:r>
+      <w:r>
+        <w:rPr>
+          <w:color w:val="000000" w:themeColor="text1"/>
+        </w:rPr>
+        <w:t xml:space="preserve">, </w:t>
+      </w:r>
+      <w:r>
+        <w:rPr>
+          <w:b/>
+          <w:bCs/>
+          <w:color w:val="000000" w:themeColor="text1"/>
+        </w:rPr>
+        <w:t>Python</w:t>
+      </w:r>
+      <w:r>
+        <w:rPr>
+          <w:color w:val="000000" w:themeColor="text1"/>
+        </w:rPr>
+        <w:t xml:space="preserve">, and </w:t>
+      </w:r>
+      <w:r>
+        <w:rPr>
+          <w:b/>
+          <w:bCs/>
+          <w:color w:val="000000" w:themeColor="text1"/>
+        </w:rPr>
+        <w:t>Tableau</w:t>
+      </w:r>
+      <w:r>
+        <w:rPr>
+          <w:color w:val="000000" w:themeColor="text1"/>
+        </w:rPr>
+        <w:t xml:space="preserve">. </w:t>
+      </w:r>
+      <w:r>
+        <w:rPr>
+          <w:color w:val="000000" w:themeColor="text1"/>
+        </w:rPr>
+        <w:t xml:space="preserve">Applied </w:t>
+      </w:r>
+      <w:r>
+        <w:rPr>
+          <w:b/>
+          <w:bCs/>
+          <w:color w:val="000000" w:themeColor="text1"/>
+        </w:rPr>
+        <w:t>hypothesis testing</w:t>
+      </w:r>
+      <w:r>
+        <w:rPr>
+          <w:color w:val="000000" w:themeColor="text1"/>
+        </w:rPr>
+        <w:t xml:space="preserve"> techniques to evaluate and measure </w:t>
+      </w:r>
+      <w:r>
+        <w:rPr>
+          <w:b/>
+          <w:bCs/>
+          <w:color w:val="000000" w:themeColor="text1"/>
+        </w:rPr>
+        <w:t>A/B test</w:t>
+      </w:r>
+      <w:r>
+        <w:rPr>
+          <w:color w:val="000000" w:themeColor="text1"/>
+        </w:rPr>
+        <w:t xml:space="preserve"> performance. </w:t>
       </w:r>
     </w:p>
     <w:p>
-      <w:r>
-        <w:pict w14:anchorId="18103E9C">
-          <v:rect id="_x0000_i1123" style="width:0;height:1.5pt" o:hralign="center" o:bullet="t" o:hrstd="t" o:hr="t"/>
-        </w:pict>
+      <w:pPr>
+        <w:pStyle w:val="Compact"/>
+        <w:numPr>
+          <w:ilvl w:val="1"/>
+          <w:numId w:val="2"/>
+        </w:numPr>
+        <w:rPr>
+          <w:color w:val="000000" w:themeColor="text1"/>
+        </w:rPr>
+      </w:pPr>
+      <w:r>
+        <w:rPr>
+          <w:color w:val="000000" w:themeColor="text1"/>
+          <w:u w:val="single"/>
+        </w:rPr>
+        <w:t>Machine Learning &amp; Feature Engineering</w:t>
+      </w:r>
+      <w:r>
+        <w:rPr>
+          <w:color w:val="000000" w:themeColor="text1"/>
+        </w:rPr>
+        <w:t xml:space="preserve">: Preprocessed data via outlier treatment, missing value handling, categorical encoding, feature scaling, and selection for ML models. </w:t>
       </w:r>
     </w:p>
     <w:p>
       <w:pPr>
-        <w:pStyle w:val="Heading2"/>
-      </w:pPr>
-      <w:bookmarkStart w:id="9" w:name="certifications-honors"/>
-      <w:bookmarkEnd w:id="8"/>
-      <w:r>
-        <w:t>CERTIFICATIONS</w:t>
-      </w:r>
-      <w:r>
-        <w:t xml:space="preserve"> AND CLEARENCE </w:t>
-      </w:r>
+        <w:pStyle w:val="Compact"/>
+        <w:numPr>
+          <w:ilvl w:val="1"/>
+          <w:numId w:val="2"/>
+        </w:numPr>
+        <w:rPr>
+          <w:color w:val="000000" w:themeColor="text1"/>
+        </w:rPr>
+      </w:pPr>
+      <w:r>
+        <w:rPr>
+          <w:color w:val="000000" w:themeColor="text1"/>
+          <w:u w:val="single"/>
+        </w:rPr>
+        <w:t>Advanced Modeling</w:t>
+      </w:r>
+      <w:r>
+        <w:rPr>
+          <w:color w:val="000000" w:themeColor="text1"/>
+        </w:rPr>
+        <w:t xml:space="preserve">: Implemented algorithms for </w:t>
+      </w:r>
+      <w:r>
+        <w:rPr>
+          <w:b/>
+          <w:bCs/>
+          <w:color w:val="000000" w:themeColor="text1"/>
+        </w:rPr>
+        <w:t>regression</w:t>
+      </w:r>
+      <w:r>
+        <w:rPr>
+          <w:color w:val="000000" w:themeColor="text1"/>
+        </w:rPr>
+        <w:t xml:space="preserve">, </w:t>
+      </w:r>
+      <w:r>
+        <w:rPr>
+          <w:b/>
+          <w:bCs/>
+          <w:color w:val="000000" w:themeColor="text1"/>
+        </w:rPr>
+        <w:t>classification</w:t>
+      </w:r>
+      <w:r>
+        <w:rPr>
+          <w:color w:val="000000" w:themeColor="text1"/>
+        </w:rPr>
+        <w:t>,</w:t>
+      </w:r>
+      <w:r>
+        <w:rPr>
+          <w:b/>
+          <w:bCs/>
+          <w:color w:val="000000" w:themeColor="text1"/>
+        </w:rPr>
+        <w:t xml:space="preserve"> clustering</w:t>
+      </w:r>
+      <w:r>
+        <w:rPr>
+          <w:color w:val="000000" w:themeColor="text1"/>
+        </w:rPr>
+        <w:t xml:space="preserve">, </w:t>
+      </w:r>
+      <w:r>
+        <w:rPr>
+          <w:b/>
+          <w:bCs/>
+          <w:color w:val="000000" w:themeColor="text1"/>
+        </w:rPr>
+        <w:t>association rule learning</w:t>
+      </w:r>
+      <w:r>
+        <w:rPr>
+          <w:color w:val="000000" w:themeColor="text1"/>
+        </w:rPr>
+        <w:t>,</w:t>
+      </w:r>
+      <w:r>
+        <w:rPr>
+          <w:b/>
+          <w:bCs/>
+          <w:color w:val="000000" w:themeColor="text1"/>
+        </w:rPr>
+        <w:t xml:space="preserve"> </w:t>
+      </w:r>
+      <w:r>
+        <w:rPr>
+          <w:color w:val="000000" w:themeColor="text1"/>
+        </w:rPr>
+        <w:t>and</w:t>
+      </w:r>
+      <w:r>
+        <w:rPr>
+          <w:b/>
+          <w:bCs/>
+          <w:color w:val="000000" w:themeColor="text1"/>
+        </w:rPr>
+        <w:t xml:space="preserve"> causal impact analysis</w:t>
+      </w:r>
+      <w:r>
+        <w:rPr>
+          <w:color w:val="000000" w:themeColor="text1"/>
+        </w:rPr>
+        <w:t xml:space="preserve"> to evaluate event impacts over time. </w:t>
+      </w:r>
+    </w:p>
+    <w:p>
+      <w:pPr>
+        <w:pStyle w:val="Compact"/>
+        <w:numPr>
+          <w:ilvl w:val="0"/>
+          <w:numId w:val="2"/>
+        </w:numPr>
+      </w:pPr>
+      <w:r>
+        <w:t xml:space="preserve">Six Sigma </w:t>
+      </w:r>
+      <w:r>
+        <w:t xml:space="preserve">White Belt </w:t>
+      </w:r>
+      <w:r>
+        <w:t>Certified</w:t>
+      </w:r>
+      <w:bookmarkEnd w:id="0"/>
+      <w:bookmarkEnd w:id="9"/>
     </w:p>
     <w:p>
       <w:pPr>
@@ -941,90 +1420,6 @@
       <w:r>
         <w:t>Active Secret Security Clearance (2019)</w:t>
       </w:r>
-    </w:p>
-    <w:p>
-      <w:pPr>
-        <w:pStyle w:val="Compact"/>
-        <w:numPr>
-          <w:ilvl w:val="0"/>
-          <w:numId w:val="2"/>
-        </w:numPr>
-      </w:pPr>
-      <w:r>
-        <w:t xml:space="preserve">Data Science Infinity Certification </w:t>
-      </w:r>
-      <w:r>
-        <w:t>|</w:t>
-      </w:r>
-      <w:r>
-        <w:t xml:space="preserve"> </w:t>
-      </w:r>
-      <w:r>
-        <w:t>April</w:t>
-      </w:r>
-      <w:r>
-        <w:t xml:space="preserve"> 202</w:t>
-      </w:r>
-      <w:r>
-        <w:t>6</w:t>
-      </w:r>
-      <w:r>
-        <w:t xml:space="preserve"> – </w:t>
-      </w:r>
-      <w:r>
-        <w:t>present</w:t>
-      </w:r>
-    </w:p>
-    <w:p>
-      <w:pPr>
-        <w:pStyle w:val="Compact"/>
-        <w:numPr>
-          <w:ilvl w:val="1"/>
-          <w:numId w:val="2"/>
-        </w:numPr>
-        <w:rPr>
-          <w:color w:val="C00000"/>
-        </w:rPr>
-      </w:pPr>
-      <w:r>
-        <w:rPr>
-          <w:color w:val="000000" w:themeColor="text1"/>
-          <w:u w:val="single"/>
-        </w:rPr>
-        <w:t>Actionable Learnings</w:t>
-      </w:r>
-      <w:r>
-        <w:rPr>
-          <w:color w:val="000000" w:themeColor="text1"/>
-        </w:rPr>
-        <w:t xml:space="preserve">: </w:t>
-      </w:r>
-      <w:r>
-        <w:rPr>
-          <w:color w:val="000000" w:themeColor="text1"/>
-        </w:rPr>
-        <w:t>Extracting, manipulating, and visualizing data using SQL, Python, and Tableau. Applying statistical concepts like hypothesis testing to measure A/B test performance. Utilizing GitHub for version control and team collaboration. Preparing data for machine learning through missing value handling, categorical encoding, outlier treatment, feature scaling, feature selection, and model validation. Implementing ML algorithms for regression, classification, clustering, association rule learning, and causal impact analysis to evaluate event impacts over time.</w:t>
-      </w:r>
-    </w:p>
-    <w:p>
-      <w:pPr>
-        <w:pStyle w:val="Compact"/>
-        <w:numPr>
-          <w:ilvl w:val="0"/>
-          <w:numId w:val="2"/>
-        </w:numPr>
-      </w:pPr>
-      <w:r>
-        <w:t xml:space="preserve">Six Sigma </w:t>
-      </w:r>
-      <w:r>
-        <w:t xml:space="preserve">White Belt </w:t>
-      </w:r>
-      <w:r>
-        <w:t>Certified</w:t>
-      </w:r>
-      <w:bookmarkEnd w:id="0"/>
-      <w:bookmarkEnd w:id="9"/>
     </w:p>
     <w:sectPr>
       <w:footnotePr>

</xml_diff>